<commit_message>
docs(research): expand Word diagnostic findings with exact candidate-linked evidence
</commit_message>
<xml_diff>
--- a/projects/scrum-board-automation/research/Acinonyx_Rework_Research_Problem_Definition.docx
+++ b/projects/scrum-board-automation/research/Acinonyx_Rework_Research_Problem_Definition.docx
@@ -609,6 +609,894 @@
         <w:t>This document defines the research problem and preliminary evidence. It is not a completed causal study or a release acceptance decision.</w:t>
       </w:r>
     </w:p>
+    <w:p>
+      <w:r>
+        <w:br w:type="page"/>
+      </w:r>
+    </w:p>
+    <w:p>
+      <w:pPr>
+        <w:pStyle w:val="Heading1"/>
+      </w:pPr>
+      <w:r>
+        <w:t>9. Detailed evidence supporting the diagnostic findings</w:t>
+      </w:r>
+    </w:p>
+    <w:p>
+      <w:r>
+        <w:t>Evidence expansion: 13 October 2026. The following observations are reproduced from candidate-specific review records. They were not rerun for this document update. Exact excerpts are quoted separately from our interpretation. Historical defects may have been corrected since the reviewed candidate; their inclusion does not assert that they remain present today.</w:t>
+      </w:r>
+    </w:p>
+    <w:p>
+      <w:pPr>
+        <w:pStyle w:val="Heading2"/>
+      </w:pPr>
+      <w:r>
+        <w:t>E01 — Incomplete enforcement: planning authority</w:t>
+      </w:r>
+    </w:p>
+    <w:p>
+      <w:r>
+        <w:t>Reviewed code candidate: 7bcdd079e484539545bc5661b6654ac6b0489b7e</w:t>
+      </w:r>
+    </w:p>
+    <w:p>
+      <w:r>
+        <w:t>Recorded observation — exact source excerpt:</w:t>
+      </w:r>
+    </w:p>
+    <w:p>
+      <w:pPr>
+        <w:pStyle w:val="Quote"/>
+      </w:pPr>
+      <w:r>
+        <w:t>1. **Name-based unbound planning permission persists.** `mas/pm/tools.py` admits a whitelist of principal names and suffixes `:architect` or `:tenant_admin` without verified role/scopes. Disposable reproduction: `ExecutionContext.scope('unprivileged:tenant_admin')` successfully publishes through `pm_publish_plan` with no tenant binding. This is a local entry-point reproduction, not a demonstrated remote exploit. **Fix:** deny unbound exposed publication or validate explicit trusted authority independently of the name; test both allowed-looking names and suffixes.</w:t>
+      </w:r>
+    </w:p>
+    <w:p>
+      <w:r>
+        <w:t>Interpretation: A permitted-looking identity suffix remained sufficient to publish without verified authority. This supports an incomplete authorization-boundary finding, not a claim of a remote exploit.</w:t>
+      </w:r>
+    </w:p>
+    <w:p>
+      <w:hyperlink r:id="rId9">
+        <w:r>
+          <w:rPr>
+            <w:color w:val="0563C1"/>
+          </w:rPr>
+          <w:t>Open original review, line 19</w:t>
+        </w:r>
+      </w:hyperlink>
+    </w:p>
+    <w:p>
+      <w:pPr>
+        <w:pStyle w:val="Heading2"/>
+      </w:pPr>
+      <w:r>
+        <w:t>E02 — Related-path failure: active reviewer removal</w:t>
+      </w:r>
+    </w:p>
+    <w:p>
+      <w:r>
+        <w:t>Reviewed code candidate: 148ad03403887c8a63471553ecc192060ba072e1</w:t>
+      </w:r>
+    </w:p>
+    <w:p>
+      <w:r>
+        <w:t>Recorded observation — exact source excerpt:</w:t>
+      </w:r>
+    </w:p>
+    <w:p>
+      <w:pPr>
+        <w:pStyle w:val="Quote"/>
+      </w:pPr>
+      <w:r>
+        <w:t>1. **Active reviewer removal changes live policy.** In `mas/pm/plans.py`, a change from a nonempty reviewer requirement to `None` sets `staged_rev=None`, but `effective_rev` uses `staged_rev is not None` as its staging discriminator. Independent reproduction: create a task requiring `independent`, mark it IN_PROGRESS, then publish a revision with no reviewer requirement. Stored live reviewer becomes null, pending reconciliation true, staged reviewer null. The pending transition guard helps, but the live policy is already erased. **Fix:** represent staged removal explicitly; preserve live policy for every active change, including null/empty values; test authorized application and rejection of the proposal.</w:t>
+      </w:r>
+    </w:p>
+    <w:p>
+      <w:r>
+        <w:t>Interpretation: The first scope-staging correction did not cover null/removal semantics. This is a concrete edge case under the same preservation requirement.</w:t>
+      </w:r>
+    </w:p>
+    <w:p>
+      <w:hyperlink r:id="rId10">
+        <w:r>
+          <w:rPr>
+            <w:color w:val="0563C1"/>
+          </w:rPr>
+          <w:t>Open original review, line 15</w:t>
+        </w:r>
+      </w:hyperlink>
+    </w:p>
+    <w:p>
+      <w:pPr>
+        <w:pStyle w:val="Heading2"/>
+      </w:pPr>
+      <w:r>
+        <w:t>E03 — Failure testing: browser records not asserted</w:t>
+      </w:r>
+    </w:p>
+    <w:p>
+      <w:r>
+        <w:t>Reviewed code candidate: d19b0924a67edbd0e82d54f385e01031a89a5a43</w:t>
+      </w:r>
+    </w:p>
+    <w:p>
+      <w:r>
+        <w:t>Recorded observation — exact source excerpt:</w:t>
+      </w:r>
+    </w:p>
+    <w:p>
+      <w:pPr>
+        <w:pStyle w:val="Quote"/>
+      </w:pPr>
+      <w:r>
+        <w:t>4. **Browser acceptance evidence does not assert the claimed records.** record_browser_evidence.py appends “Board rendered live issues SBA-1 and SBA-2” without checking cards or project content. It also seeds DONE/IN_PROGRESS directly as display fixtures, not independently verified workflow states. Independent rerun printed success although the screenshot showed no projects. Fix: explicitly assert expected project, card keys and count; label fixtures synthetic and never use seeded DONE as workflow proof. Add actual create/transition/revocation interaction tests through the same tenant-bound browser. Correct BROWSER_EVIDENCE_REPORT.md and delivery claims around the failing candidate.</w:t>
+      </w:r>
+    </w:p>
+    <w:p>
+      <w:r>
+        <w:t>Interpretation: The recorded success claim was not backed by an assertion of the expected project/cards. This explains how a failing board could accompany a positive report.</w:t>
+      </w:r>
+    </w:p>
+    <w:p>
+      <w:hyperlink r:id="rId11">
+        <w:r>
+          <w:rPr>
+            <w:color w:val="0563C1"/>
+          </w:rPr>
+          <w:t>Open original review, line 19</w:t>
+        </w:r>
+      </w:hyperlink>
+    </w:p>
+    <w:p>
+      <w:pPr>
+        <w:pStyle w:val="Heading2"/>
+      </w:pPr>
+      <w:r>
+        <w:t>E04 — Failure testing: forged receipt expected to pass</w:t>
+      </w:r>
+    </w:p>
+    <w:p>
+      <w:r>
+        <w:t>Reviewed code candidate: fc4886cd99ec2c5ad05615026bdd1807cac2f883</w:t>
+      </w:r>
+    </w:p>
+    <w:p>
+      <w:r>
+        <w:t>Recorded observation — exact source excerpt:</w:t>
+      </w:r>
+    </w:p>
+    <w:p>
+      <w:pPr>
+        <w:pStyle w:val="Quote"/>
+      </w:pPr>
+      <w:r>
+        <w:t>1. **Forged receipts obtain trusted admission.** `admit_evidence_receipt` only checks mutation authority and SUBMITTED state; it never validates key ID/signature, full envelope or run/attempt/candidate ownership. Independent reproduction stores signature `forged` and unknown key with arbitrary payload, then promotes it successfully. The current test_negative_case_8 explicitly expects the forged record to become ADMITTED under trusted scope, so it proves permission gating rather than authenticity. **Required solution:** if the coordinator verifier is deferred, keep promotion disabled with a fail-closed error and retain SUBMITTED status. Otherwise implement verification against approved issuer keys and complete canonical identity envelope before one atomic promotion; use a distinct admission capability. Change the test to reject fake signatures even for an authorized observer. Authorization is not authenticity.</w:t>
+      </w:r>
+    </w:p>
+    <w:p>
+      <w:r>
+        <w:t>Interpretation: The test verified authority gating while expecting admission of unauthenticated content. It therefore tested a weaker property than evidence authenticity.</w:t>
+      </w:r>
+    </w:p>
+    <w:p>
+      <w:hyperlink r:id="rId12">
+        <w:r>
+          <w:rPr>
+            <w:color w:val="0563C1"/>
+          </w:rPr>
+          <w:t>Open original review, line 15</w:t>
+        </w:r>
+      </w:hyperlink>
+    </w:p>
+    <w:p>
+      <w:pPr>
+        <w:pStyle w:val="Heading2"/>
+      </w:pPr>
+      <w:r>
+        <w:t>E05 — Historical integration: migration ledger bypass</w:t>
+      </w:r>
+    </w:p>
+    <w:p>
+      <w:r>
+        <w:t>Reviewed code candidate: fc4886cd99ec2c5ad05615026bdd1807cac2f883</w:t>
+      </w:r>
+    </w:p>
+    <w:p>
+      <w:r>
+        <w:t>Recorded observation — exact source excerpt:</w:t>
+      </w:r>
+    </w:p>
+    <w:p>
+      <w:pPr>
+        <w:pStyle w:val="Quote"/>
+      </w:pPr>
+      <w:r>
+        <w:t>2. **Migration ledger bypasses upgrades already marked applied.** Revised DDL keeps version 2026101201 and the same checksum label. When that entry exists, migration returns before inspecting/rebuilding missing structures. Independent reproduction uses actual historical code in sequence: 284cb877 database -&gt; 9c2de7a8 migration -&gt; current candidate. receipt table still lacks admission_status. **Required solution:** freeze historical migration identities and add a NEW version for correction. Under BEGIN IMMEDIATE, validate actual schema and rebuild/alter missing structures with data preservation. Compute a real migration-content checksum. Test this exact upgrade chain with populated runs/events/receipts and ledger, plus injected rollback and reopen. Do not edit or silently delete the old ledger to make tests pass.</w:t>
+      </w:r>
+    </w:p>
+    <w:p>
+      <w:r>
+        <w:t>Interpretation: Testing a fresh schema did not cover the actual already-applied migration chain. The review names the historical sequence explicitly.</w:t>
+      </w:r>
+    </w:p>
+    <w:p>
+      <w:hyperlink r:id="rId13">
+        <w:r>
+          <w:rPr>
+            <w:color w:val="0563C1"/>
+          </w:rPr>
+          <w:t>Open original review, line 17</w:t>
+        </w:r>
+      </w:hyperlink>
+    </w:p>
+    <w:p>
+      <w:pPr>
+        <w:pStyle w:val="Heading2"/>
+      </w:pPr>
+      <w:r>
+        <w:t>E06 — Replay integrity: changed termination content accepted</w:t>
+      </w:r>
+    </w:p>
+    <w:p>
+      <w:r>
+        <w:t>Reviewed code candidate: fc4886cd99ec2c5ad05615026bdd1807cac2f883</w:t>
+      </w:r>
+    </w:p>
+    <w:p>
+      <w:r>
+        <w:t>Recorded observation — exact source excerpt:</w:t>
+      </w:r>
+    </w:p>
+    <w:p>
+      <w:pPr>
+        <w:pStyle w:val="Quote"/>
+      </w:pPr>
+      <w:r>
+        <w:t>3. **Conflicting termination receipt replay accepted.** Replay compares run_id/attempt_id only. Independent reproduction: record termination receipt `term` with exit -15/spend 2, replay same ID with exit 0/spend 9; returns true. Canonical stored termination payload lacks spending and full receipt identity; synthetic `sig:system:observer` is written as ADMITTED, task_id is populated with attempt_id. **Required solution:** use a separate trusted observation record or a real signed envelope, never placeholder cryptographic proof. Persist full normalized intent/run/attempt/generation/exit/status/spend/observer receipt content and canonical digest. Identical replay returns original outcome; any changed field rejects without accounting or state changes. Derive task identity from the persisted mapping. Verify observer authority separately from generic storage write.</w:t>
+      </w:r>
+    </w:p>
+    <w:p>
+      <w:r>
+        <w:t>Interpretation: Matching record identity alone did not establish identical observation content. This is a replay-integrity gap, not a distinct measured labor percentage.</w:t>
+      </w:r>
+    </w:p>
+    <w:p>
+      <w:hyperlink r:id="rId14">
+        <w:r>
+          <w:rPr>
+            <w:color w:val="0563C1"/>
+          </w:rPr>
+          <w:t>Open original review, line 19</w:t>
+        </w:r>
+      </w:hyperlink>
+    </w:p>
+    <w:p>
+      <w:pPr>
+        <w:pStyle w:val="Heading2"/>
+      </w:pPr>
+      <w:r>
+        <w:t>E07 — Mechanism–guarantee mismatch: execution survives stop</w:t>
+      </w:r>
+    </w:p>
+    <w:p>
+      <w:r>
+        <w:t>Reviewed code candidate: f6d2f34a7f7c72872d10769177ae06f1fe2315a2</w:t>
+      </w:r>
+    </w:p>
+    <w:p>
+      <w:r>
+        <w:t>Recorded observation — exact source excerpt:</w:t>
+      </w:r>
+    </w:p>
+    <w:p>
+      <w:pPr>
+        <w:pStyle w:val="Quote"/>
+      </w:pPr>
+      <w:r>
+        <w:t>1. **Adapter execution survives a timeout.** Worker supervision still uses a daemon Python thread and a cooperative event. After timeout it records UNKNOWN_EXECUTION and returns, without joining/terminating adapter execution. The new uncooperative test only checks absence of an event immediately; it does not observe later filesystem effects or surviving execution. Independent controlled adapter ignores stop, sleeps .2 seconds, then writes a real disposable file. Worker returned at .038 seconds for a .03-second deadline; the file appeared after return. Holds remain retained, which is correct, but does not establish bounded execution containment. **Required fix:** either restrict CC-04 to an explicitly enforced set of qualified controlled adapters, rejecting unsupported stop capabilities, or run adapter work in an actually terminable supervised execution boundary. Observe termination within cleanup deadline; reject/quarantine late IPC results/events; unknown remote effects retain holds. Tests must wait past the side-effect deadline and inspect execution survival. Do not describe event suppression as cancellation of external effects.</w:t>
+      </w:r>
+    </w:p>
+    <w:p>
+      <w:r>
+        <w:t>Interpretation: The persisted UNKNOWN_EXECUTION state and retained hold were correct, but they did not stop the physical side effect. The timing probe demonstrates the distinction.</w:t>
+      </w:r>
+    </w:p>
+    <w:p>
+      <w:hyperlink r:id="rId15">
+        <w:r>
+          <w:rPr>
+            <w:color w:val="0563C1"/>
+          </w:rPr>
+          <w:t>Open original review, line 13</w:t>
+        </w:r>
+      </w:hyperlink>
+    </w:p>
+    <w:p>
+      <w:pPr>
+        <w:pStyle w:val="Heading2"/>
+      </w:pPr>
+      <w:r>
+        <w:t>E08 — Repeated correction: registered configuration bypass</w:t>
+      </w:r>
+    </w:p>
+    <w:p>
+      <w:r>
+        <w:t>Reviewed code candidate: 07294b0fb74d4073b9cd2315cc0f60f35fc9ab38</w:t>
+      </w:r>
+    </w:p>
+    <w:p>
+      <w:r>
+        <w:t>Recorded observation — exact source excerpt:</w:t>
+      </w:r>
+    </w:p>
+    <w:p>
+      <w:pPr>
+        <w:pStyle w:val="Quote"/>
+      </w:pPr>
+      <w:r>
+        <w:t>**Registered adapter has unsafe test escape hatches.** SyntheticExecutionAdapter accepts ignore_stop_signal=True and an arbitrary on_stop callback. Worker registration validates class identity but not these options. Independent reproduction uses the exact registered class, duration .2, ignore_stop_signal=True, callback writing a disposable file, execution timeout .01 and cleanup .01. Worker returns .026 seconds; file is absent on return and present afterward. Intent honestly remains UNKNOWN_EXECUTION and budget uncertainty is retained, but local execution still survives its admitted boundary.</w:t>
+      </w:r>
+    </w:p>
+    <w:p>
+      <w:r>
+        <w:t>Interpretation: A class registry addressed implementation identity, but options in that very class defeated termination. This supports the symptom-versus-invariant diagnosis.</w:t>
+      </w:r>
+    </w:p>
+    <w:p>
+      <w:hyperlink r:id="rId16">
+        <w:r>
+          <w:rPr>
+            <w:color w:val="0563C1"/>
+          </w:rPr>
+          <w:t>Open original review, line 13</w:t>
+        </w:r>
+      </w:hyperlink>
+    </w:p>
+    <w:p>
+      <w:pPr>
+        <w:pStyle w:val="Heading2"/>
+      </w:pPr>
+      <w:r>
+        <w:t>E09 — Evidence integrity: printed tests treated as execution</w:t>
+      </w:r>
+    </w:p>
+    <w:p>
+      <w:r>
+        <w:t>Reviewed code candidate: b4db4a7d1dd3d65273810899341ff0cb2b5178d7</w:t>
+      </w:r>
+    </w:p>
+    <w:p>
+      <w:r>
+        <w:t>Recorded observation — exact source excerpt:</w:t>
+      </w:r>
+    </w:p>
+    <w:p>
+      <w:pPr>
+        <w:pStyle w:val="Quote"/>
+      </w:pPr>
+      <w:r>
+        <w:t>2. **Issue:** `VerifierAdapter.verify_candidate` derives executed count from a regex over arbitrary stdout. Candidate checkout does not isolate code or protect the verifier environment/files; base commit is copied without validation. **Impact:** manufactured test text becomes signed production evidence, and candidate code executes with verifier-host authority. **Reproduction:** the submitted fixture's Python command prints `1 passed in 0.01s` without running any tests; independent execution produces signed `passed=True`. **Remediation:** use an owner-controlled, immutable test contract and verifier-owned runner/results channel outside candidate control; bind suite/image/base/candidate/fence and actual measured outcomes. Run untrusted code in an enforceable restricted boundary with no verifier secrets or shared writable control files. A worktree alone is not that boundary.</w:t>
+      </w:r>
+    </w:p>
+    <w:p>
+      <w:r>
+        <w:t>Interpretation: Checkout did not make candidate-controlled stdout trustworthy. The recorded probe ran no tests but produced a signed passing result.</w:t>
+      </w:r>
+    </w:p>
+    <w:p>
+      <w:hyperlink r:id="rId17">
+        <w:r>
+          <w:rPr>
+            <w:color w:val="0563C1"/>
+          </w:rPr>
+          <w:t>Open original review, line 14</w:t>
+        </w:r>
+      </w:hyperlink>
+    </w:p>
+    <w:p>
+      <w:pPr>
+        <w:pStyle w:val="Heading2"/>
+      </w:pPr>
+      <w:r>
+        <w:t>E10 — Atomic enforcement: launch policy race</w:t>
+      </w:r>
+    </w:p>
+    <w:p>
+      <w:r>
+        <w:t>Reviewed code candidate: f6d2f34a7f7c72872d10769177ae06f1fe2315a2</w:t>
+      </w:r>
+    </w:p>
+    <w:p>
+      <w:r>
+        <w:t>Recorded observation — exact source excerpt:</w:t>
+      </w:r>
+    </w:p>
+    <w:p>
+      <w:pPr>
+        <w:pStyle w:val="Quote"/>
+      </w:pPr>
+      <w:r>
+        <w:t>2. **Policy authorization races pre-spawn.** Worker reads current policy in a separate operation, then calls pre_spawn_intent whose atomic update does not revalidate admitted policy/version/pending reconciliation. Independent controlled interleaving updates issue policy from 1 to 2 immediately before the actual pre-spawn call; worker executes and completes using the admitted old payload. **Required fix:** inside the pre-spawn transaction, re-read issue policy, pending reconciliation, admitted scope/funded authorization and eligible workflow state. Require the exact admitted policy in the guarded launch update; insert the run and update attempt only after that same decision succeeds. Policy changes after launch must revoke/fence active authority before admitting stale results; define safe interruption/reconciliation rather than merely matching a previously fetched object. Add competing plan update/pre-spawn and pending-reconciliation regressions.</w:t>
+      </w:r>
+    </w:p>
+    <w:p>
+      <w:r>
+        <w:t>Interpretation: A separately checked policy could change before launch. Permission must participate in the atomic launch decision.</w:t>
+      </w:r>
+    </w:p>
+    <w:p>
+      <w:hyperlink r:id="rId18">
+        <w:r>
+          <w:rPr>
+            <w:color w:val="0563C1"/>
+          </w:rPr>
+          <w:t>Open original review, line 15</w:t>
+        </w:r>
+      </w:hyperlink>
+    </w:p>
+    <w:p>
+      <w:pPr>
+        <w:pStyle w:val="Heading1"/>
+      </w:pPr>
+      <w:r>
+        <w:t>10. Evidence of changing specifications and reporting errors</w:t>
+      </w:r>
+    </w:p>
+    <w:p>
+      <w:r>
+        <w:t>The reviews also refined proposal versioning, strict HTTP types, adapter qualification and controlled-only acceptance. These changes cannot all be attributed to the implementer without comparing each requirement with its original version. The evidence supports repeated failures after explicit directives; it does not establish that every initial omission violated an already-agreed detailed requirement.</w:t>
+      </w:r>
+    </w:p>
+    <w:p>
+      <w:r>
+        <w:t>Exact correction of the review evidence:</w:t>
+      </w:r>
+    </w:p>
+    <w:p>
+      <w:pPr>
+        <w:pStyle w:val="Quote"/>
+      </w:pPr>
+      <w:r>
+        <w:t>`51a08a12` contained three errors:</w:t>
+        <w:br/>
+        <w:br/>
+        <w:t>1. It reported per-file counts of 4 / 30 / 27. These were wrong. The real runner counts are below.</w:t>
+        <w:br/>
+        <w:t>2. It cited a full gate that had been launched but whose result had not been read.</w:t>
+        <w:br/>
+        <w:t>3. It claimed container behaviour had been reproduced independently. That claim is withdrawn: no container check could run in this environment.</w:t>
+      </w:r>
+    </w:p>
+    <w:p>
+      <w:hyperlink r:id="rId19">
+        <w:r>
+          <w:rPr>
+            <w:color w:val="0563C1"/>
+          </w:rPr>
+          <w:t>Open revised independent review</w:t>
+        </w:r>
+      </w:hyperlink>
+    </w:p>
+    <w:p>
+      <w:r>
+        <w:t>Interpretation: missing Docker is an infrastructure limitation. Claiming unavailable checks were reproduced is a review/reporting error. This example concerns Antigravity reviewing Codex-authored code, demonstrating that the research must include reviewer mistakes as well as implementation defects.</w:t>
+      </w:r>
+    </w:p>
+    <w:p>
+      <w:pPr>
+        <w:pStyle w:val="Heading1"/>
+      </w:pPr>
+      <w:r>
+        <w:t>11. Complete counted rejection register</w:t>
+      </w:r>
+    </w:p>
+    <w:p>
+      <w:pPr>
+        <w:pStyle w:val="Heading2"/>
+      </w:pPr>
+      <w:r>
+        <w:t>R01 — SBA-02/SBA-05, submission round 1</w:t>
+      </w:r>
+    </w:p>
+    <w:p>
+      <w:r>
+        <w:t>Builder: Antigravity. Reviewer: Codex. Recorded result: rejected for the specified implementation package. Other discovery/design verdicts in the same review are separate.</w:t>
+      </w:r>
+    </w:p>
+    <w:p>
+      <w:hyperlink r:id="rId20">
+        <w:r>
+          <w:rPr>
+            <w:color w:val="0563C1"/>
+          </w:rPr>
+          <w:t>SBA_02_05_BACKEND_REVIEW.md</w:t>
+        </w:r>
+      </w:hyperlink>
+    </w:p>
+    <w:p>
+      <w:pPr>
+        <w:pStyle w:val="Heading2"/>
+      </w:pPr>
+      <w:r>
+        <w:t>R02 — SBA-02/SBA-05, submission round 2</w:t>
+      </w:r>
+    </w:p>
+    <w:p>
+      <w:r>
+        <w:t>Builder: Antigravity. Reviewer: Codex. Recorded result: rejected for the specified implementation package. Other discovery/design verdicts in the same review are separate.</w:t>
+      </w:r>
+    </w:p>
+    <w:p>
+      <w:hyperlink r:id="rId21">
+        <w:r>
+          <w:rPr>
+            <w:color w:val="0563C1"/>
+          </w:rPr>
+          <w:t>SBA_02_05_REWORK_REVIEW.md</w:t>
+        </w:r>
+      </w:hyperlink>
+    </w:p>
+    <w:p>
+      <w:pPr>
+        <w:pStyle w:val="Heading2"/>
+      </w:pPr>
+      <w:r>
+        <w:t>R03 — SBA-03, submission round 1</w:t>
+      </w:r>
+    </w:p>
+    <w:p>
+      <w:r>
+        <w:t>Builder: Antigravity. Reviewer: Codex. Recorded result: rejected for the specified implementation package. Other discovery/design verdicts in the same review are separate.</w:t>
+      </w:r>
+    </w:p>
+    <w:p>
+      <w:hyperlink r:id="rId22">
+        <w:r>
+          <w:rPr>
+            <w:color w:val="0563C1"/>
+          </w:rPr>
+          <w:t>SBA_03_REVIEW.md</w:t>
+        </w:r>
+      </w:hyperlink>
+    </w:p>
+    <w:p>
+      <w:pPr>
+        <w:pStyle w:val="Heading2"/>
+      </w:pPr>
+      <w:r>
+        <w:t>R04 — SBA-03, submission round 2</w:t>
+      </w:r>
+    </w:p>
+    <w:p>
+      <w:r>
+        <w:t>Builder: Antigravity. Reviewer: Codex. Recorded result: rejected for the specified implementation package. Other discovery/design verdicts in the same review are separate.</w:t>
+      </w:r>
+    </w:p>
+    <w:p>
+      <w:hyperlink r:id="rId23">
+        <w:r>
+          <w:rPr>
+            <w:color w:val="0563C1"/>
+          </w:rPr>
+          <w:t>CC_01_SBA_03_RESUBMISSION_REVIEW.md</w:t>
+        </w:r>
+      </w:hyperlink>
+    </w:p>
+    <w:p>
+      <w:pPr>
+        <w:pStyle w:val="Heading2"/>
+      </w:pPr>
+      <w:r>
+        <w:t>R05 — SBA-03, submission round 3</w:t>
+      </w:r>
+    </w:p>
+    <w:p>
+      <w:r>
+        <w:t>Builder: Antigravity. Reviewer: Codex. Recorded result: rejected for the specified implementation package. Other discovery/design verdicts in the same review are separate.</w:t>
+      </w:r>
+    </w:p>
+    <w:p>
+      <w:hyperlink r:id="rId24">
+        <w:r>
+          <w:rPr>
+            <w:color w:val="0563C1"/>
+          </w:rPr>
+          <w:t>CC_02_SBA_03_REVIEW.md</w:t>
+        </w:r>
+      </w:hyperlink>
+    </w:p>
+    <w:p>
+      <w:pPr>
+        <w:pStyle w:val="Heading2"/>
+      </w:pPr>
+      <w:r>
+        <w:t>R06 — SBA-03, submission round 4</w:t>
+      </w:r>
+    </w:p>
+    <w:p>
+      <w:r>
+        <w:t>Builder: Antigravity. Reviewer: Codex. Recorded result: rejected for the specified implementation package. Other discovery/design verdicts in the same review are separate.</w:t>
+      </w:r>
+    </w:p>
+    <w:p>
+      <w:hyperlink r:id="rId25">
+        <w:r>
+          <w:rPr>
+            <w:color w:val="0563C1"/>
+          </w:rPr>
+          <w:t>CC_02_REVIEW_3.md</w:t>
+        </w:r>
+      </w:hyperlink>
+    </w:p>
+    <w:p>
+      <w:pPr>
+        <w:pStyle w:val="Heading2"/>
+      </w:pPr>
+      <w:r>
+        <w:t>R07 — SBA-03, submission round 5</w:t>
+      </w:r>
+    </w:p>
+    <w:p>
+      <w:r>
+        <w:t>Builder: Antigravity. Reviewer: Codex. Recorded result: rejected for the specified implementation package. Other discovery/design verdicts in the same review are separate.</w:t>
+      </w:r>
+    </w:p>
+    <w:p>
+      <w:hyperlink r:id="rId26">
+        <w:r>
+          <w:rPr>
+            <w:color w:val="0563C1"/>
+          </w:rPr>
+          <w:t>CC_02_REVIEW_4.md</w:t>
+        </w:r>
+      </w:hyperlink>
+    </w:p>
+    <w:p>
+      <w:pPr>
+        <w:pStyle w:val="Heading2"/>
+      </w:pPr>
+      <w:r>
+        <w:t>R08 — CC-03, submission round 1</w:t>
+      </w:r>
+    </w:p>
+    <w:p>
+      <w:r>
+        <w:t>Builder: Antigravity. Reviewer: Codex. Recorded result: rejected for the specified implementation package. Other discovery/design verdicts in the same review are separate.</w:t>
+      </w:r>
+    </w:p>
+    <w:p>
+      <w:hyperlink r:id="rId27">
+        <w:r>
+          <w:rPr>
+            <w:color w:val="0563C1"/>
+          </w:rPr>
+          <w:t>CC_03_INDEPENDENT_REVIEW.md</w:t>
+        </w:r>
+      </w:hyperlink>
+    </w:p>
+    <w:p>
+      <w:pPr>
+        <w:pStyle w:val="Heading2"/>
+      </w:pPr>
+      <w:r>
+        <w:t>R09 — CC-03, submission round 2</w:t>
+      </w:r>
+    </w:p>
+    <w:p>
+      <w:r>
+        <w:t>Builder: Antigravity. Reviewer: Codex. Recorded result: rejected for the specified implementation package. Other discovery/design verdicts in the same review are separate.</w:t>
+      </w:r>
+    </w:p>
+    <w:p>
+      <w:hyperlink r:id="rId28">
+        <w:r>
+          <w:rPr>
+            <w:color w:val="0563C1"/>
+          </w:rPr>
+          <w:t>CC_03_REWORK_REVIEW.md</w:t>
+        </w:r>
+      </w:hyperlink>
+    </w:p>
+    <w:p>
+      <w:pPr>
+        <w:pStyle w:val="Heading2"/>
+      </w:pPr>
+      <w:r>
+        <w:t>R10 — CC-03, submission round 3</w:t>
+      </w:r>
+    </w:p>
+    <w:p>
+      <w:r>
+        <w:t>Builder: Antigravity. Reviewer: Codex. Recorded result: rejected for the specified implementation package. Other discovery/design verdicts in the same review are separate.</w:t>
+      </w:r>
+    </w:p>
+    <w:p>
+      <w:hyperlink r:id="rId29">
+        <w:r>
+          <w:rPr>
+            <w:color w:val="0563C1"/>
+          </w:rPr>
+          <w:t>CC_03_REVIEW_3.md</w:t>
+        </w:r>
+      </w:hyperlink>
+    </w:p>
+    <w:p>
+      <w:pPr>
+        <w:pStyle w:val="Heading2"/>
+      </w:pPr>
+      <w:r>
+        <w:t>R11 — CC-04, submission round 1</w:t>
+      </w:r>
+    </w:p>
+    <w:p>
+      <w:r>
+        <w:t>Builder: Antigravity. Reviewer: Codex. Recorded result: rejected for the specified implementation package. Other discovery/design verdicts in the same review are separate.</w:t>
+      </w:r>
+    </w:p>
+    <w:p>
+      <w:hyperlink r:id="rId30">
+        <w:r>
+          <w:rPr>
+            <w:color w:val="0563C1"/>
+          </w:rPr>
+          <w:t>CC_04_INDEPENDENT_REVIEW.md</w:t>
+        </w:r>
+      </w:hyperlink>
+    </w:p>
+    <w:p>
+      <w:pPr>
+        <w:pStyle w:val="Heading2"/>
+      </w:pPr>
+      <w:r>
+        <w:t>R12 — CC-04, submission round 2</w:t>
+      </w:r>
+    </w:p>
+    <w:p>
+      <w:r>
+        <w:t>Builder: Antigravity. Reviewer: Codex. Recorded result: rejected for the specified implementation package. Other discovery/design verdicts in the same review are separate.</w:t>
+      </w:r>
+    </w:p>
+    <w:p>
+      <w:hyperlink r:id="rId31">
+        <w:r>
+          <w:rPr>
+            <w:color w:val="0563C1"/>
+          </w:rPr>
+          <w:t>CC_04_REWORK_REVIEW.md</w:t>
+        </w:r>
+      </w:hyperlink>
+    </w:p>
+    <w:p>
+      <w:pPr>
+        <w:pStyle w:val="Heading2"/>
+      </w:pPr>
+      <w:r>
+        <w:t>R13 — CC-04, submission round 3</w:t>
+      </w:r>
+    </w:p>
+    <w:p>
+      <w:r>
+        <w:t>Builder: Antigravity. Reviewer: Codex. Recorded result: rejected for the specified implementation package. Other discovery/design verdicts in the same review are separate.</w:t>
+      </w:r>
+    </w:p>
+    <w:p>
+      <w:hyperlink r:id="rId32">
+        <w:r>
+          <w:rPr>
+            <w:color w:val="0563C1"/>
+          </w:rPr>
+          <w:t>CC_04_REVIEW_3.md</w:t>
+        </w:r>
+      </w:hyperlink>
+    </w:p>
+    <w:p>
+      <w:pPr>
+        <w:pStyle w:val="Heading2"/>
+      </w:pPr>
+      <w:r>
+        <w:t>R14 — CC-04, submission round 4</w:t>
+      </w:r>
+    </w:p>
+    <w:p>
+      <w:r>
+        <w:t>Builder: Antigravity. Reviewer: Codex. Recorded result: rejected for the specified implementation package. Other discovery/design verdicts in the same review are separate.</w:t>
+      </w:r>
+    </w:p>
+    <w:p>
+      <w:hyperlink r:id="rId33">
+        <w:r>
+          <w:rPr>
+            <w:color w:val="0563C1"/>
+          </w:rPr>
+          <w:t>CC_04_REVIEW_4.md</w:t>
+        </w:r>
+      </w:hyperlink>
+    </w:p>
+    <w:p>
+      <w:pPr>
+        <w:pStyle w:val="Heading2"/>
+      </w:pPr>
+      <w:r>
+        <w:t>R15 — CC-04, submission round 5</w:t>
+      </w:r>
+    </w:p>
+    <w:p>
+      <w:r>
+        <w:t>Builder: Antigravity. Reviewer: Codex. Recorded result: rejected for the specified implementation package. Other discovery/design verdicts in the same review are separate.</w:t>
+      </w:r>
+    </w:p>
+    <w:p>
+      <w:hyperlink r:id="rId34">
+        <w:r>
+          <w:rPr>
+            <w:color w:val="0563C1"/>
+          </w:rPr>
+          <w:t>CC_04_REVIEW_5.md</w:t>
+        </w:r>
+      </w:hyperlink>
+    </w:p>
+    <w:p>
+      <w:pPr>
+        <w:pStyle w:val="Heading2"/>
+      </w:pPr>
+      <w:r>
+        <w:t>R16 — CC-05/CC-06, submission round 1</w:t>
+      </w:r>
+    </w:p>
+    <w:p>
+      <w:r>
+        <w:t>Builder: Antigravity. Reviewer: Codex. Recorded result: rejected for the specified implementation package. Other discovery/design verdicts in the same review are separate.</w:t>
+      </w:r>
+    </w:p>
+    <w:p>
+      <w:hyperlink r:id="rId35">
+        <w:r>
+          <w:rPr>
+            <w:color w:val="0563C1"/>
+          </w:rPr>
+          <w:t>CC_05_06_INDEPENDENT_REVIEW.md</w:t>
+        </w:r>
+      </w:hyperlink>
+    </w:p>
+    <w:p>
+      <w:pPr>
+        <w:pStyle w:val="Heading2"/>
+      </w:pPr>
+      <w:r>
+        <w:t>R17 — CC-05/CC-06, submission round 2</w:t>
+      </w:r>
+    </w:p>
+    <w:p>
+      <w:r>
+        <w:t>Builder: Antigravity. Reviewer: Codex. Recorded result: rejected for the specified implementation package. Other discovery/design verdicts in the same review are separate.</w:t>
+      </w:r>
+    </w:p>
+    <w:p>
+      <w:hyperlink r:id="rId36">
+        <w:r>
+          <w:rPr>
+            <w:color w:val="0563C1"/>
+          </w:rPr>
+          <w:t>CC_05_06_REWORK_REVIEW.md</w:t>
+        </w:r>
+      </w:hyperlink>
+    </w:p>
+    <w:p>
+      <w:pPr>
+        <w:pStyle w:val="Heading1"/>
+      </w:pPr>
+      <w:r>
+        <w:t>12. What this evidence establishes</w:t>
+      </w:r>
+    </w:p>
+    <w:p>
+      <w:r>
+        <w:t>The documented reproduction sequences support repeated incomplete boundary fixes, insufficient adverse-case checks, mechanism–guarantee mismatches and gaps in historical integration coverage. They also establish evidence-reporting errors and evolving contract detail. They do not establish a universal provider ranking, engineering-hours rework percentage, or that every finding was an unchanged original requirement. Review observations and interpretations remain distinct.</w:t>
+      </w:r>
+    </w:p>
     <w:sectPr>
       <w:pgSz w:w="12240" w:h="15840"/>
       <w:pgMar w:top="1440" w:right="1800" w:bottom="1440" w:left="1800" w:header="720" w:footer="720" w:gutter="0"/>

</xml_diff>

<commit_message>
docs(research): add six proposed rework interventions and evaluation measures
</commit_message>
<xml_diff>
--- a/projects/scrum-board-automation/research/Acinonyx_Rework_Research_Problem_Definition.docx
+++ b/projects/scrum-board-automation/research/Acinonyx_Rework_Research_Problem_Definition.docx
@@ -1497,6 +1497,394 @@
         <w:t>The documented reproduction sequences support repeated incomplete boundary fixes, insufficient adverse-case checks, mechanism–guarantee mismatches and gaps in historical integration coverage. They also establish evidence-reporting errors and evolving contract detail. They do not establish a universal provider ranking, engineering-hours rework percentage, or that every finding was an unchanged original requirement. Review observations and interpretations remain distinct.</w:t>
       </w:r>
     </w:p>
+    <w:p>
+      <w:r>
+        <w:br w:type="page"/>
+      </w:r>
+    </w:p>
+    <w:p>
+      <w:pPr>
+        <w:pStyle w:val="Heading1"/>
+      </w:pPr>
+      <w:r>
+        <w:t>13. Possible solutions and evaluation plan</w:t>
+      </w:r>
+    </w:p>
+    <w:p>
+      <w:r>
+        <w:t>These six interventions are proposals derived from the observed failure patterns. Their effectiveness has not yet been demonstrated. The purpose is to prevent avoidable rejection through earlier defect discovery and more complete corrections, while retaining independent acceptance. Routine technical preparation and handoffs belong to the coordinator, implementer and reviewer; the project owner supplies business direction and resolves scope or release decisions.</w:t>
+      </w:r>
+    </w:p>
+    <w:p>
+      <w:pPr>
+        <w:pStyle w:val="Heading2"/>
+      </w:pPr>
+      <w:r>
+        <w:t>13.1 Agree a versioned acceptance contract before coding</w:t>
+      </w:r>
+    </w:p>
+    <w:p>
+      <w:r>
+        <w:rPr>
+          <w:b/>
+        </w:rPr>
+        <w:t xml:space="preserve">Explanation: </w:t>
+      </w:r>
+      <w:r>
+        <w:t>The coordinator and reviewer translate the goal into required behavior, prohibited behavior, authorized scope, critical invariants and candidate-specific evidence. The implementer confirms understanding before starting. Cancellation, for example, distinguishes a stop request from confirmed termination and unresolved external effects.</w:t>
+      </w:r>
+    </w:p>
+    <w:p>
+      <w:r>
+        <w:rPr>
+          <w:b/>
+        </w:rPr>
+        <w:t xml:space="preserve">Application: </w:t>
+      </w:r>
+      <w:r>
+        <w:t>Create a task brief with requirement IDs, contract version, failure scenarios and acceptance checks. Preserve that baseline; any subsequent requirement addition is explicitly classified as scope change rather than automatically counted as an original implementation defect.</w:t>
+      </w:r>
+    </w:p>
+    <w:p>
+      <w:r>
+        <w:rPr>
+          <w:b/>
+        </w:rPr>
+        <w:t xml:space="preserve">Connection to findings: </w:t>
+      </w:r>
+      <w:r>
+        <w:t>Addresses ambiguous scope and requirements becoming more precise during review. It also makes first-pass acceptance a fairer comparison.</w:t>
+      </w:r>
+    </w:p>
+    <w:p>
+      <w:r>
+        <w:rPr>
+          <w:b/>
+        </w:rPr>
+        <w:t xml:space="preserve">Evaluation: </w:t>
+      </w:r>
+      <w:r>
+        <w:t>Measure rejection findings attributable to previously unspecified requirements and the fraction of tasks with an agreed baseline. Do not treat every clarification as scope change; compare it with the original requirement.</w:t>
+      </w:r>
+    </w:p>
+    <w:p>
+      <w:pPr>
+        <w:pStyle w:val="Heading2"/>
+      </w:pPr>
+      <w:r>
+        <w:t>13.2 Review the enforcement mechanism before implementation</w:t>
+      </w:r>
+    </w:p>
+    <w:p>
+      <w:r>
+        <w:rPr>
+          <w:b/>
+        </w:rPr>
+        <w:t xml:space="preserve">Explanation: </w:t>
+      </w:r>
+      <w:r>
+        <w:t>The implementer explains how each consequential rule is enforced. The reviewer assesses whether that mechanism provides the promised guarantee before substantial coding. A cooperative stop signal is insufficient for arbitrary uncooperative execution; a signature establishes integrity of bytes, not truth of the signed claim.</w:t>
+      </w:r>
+    </w:p>
+    <w:p>
+      <w:r>
+        <w:rPr>
+          <w:b/>
+        </w:rPr>
+        <w:t xml:space="preserve">Application: </w:t>
+      </w:r>
+      <w:r>
+        <w:t>Use a short design checkpoint for authority, isolation, funding, evidence and recovery decisions. State the threat/failure model, enforcement boundary and how the guarantee will be falsified in a test. Record reviewer concerns and disposition.</w:t>
+      </w:r>
+    </w:p>
+    <w:p>
+      <w:r>
+        <w:rPr>
+          <w:b/>
+        </w:rPr>
+        <w:t xml:space="preserve">Connection to findings: </w:t>
+      </w:r>
+      <w:r>
+        <w:t>Addresses mechanism–guarantee mismatches that otherwise require architecture repair after implementation.</w:t>
+      </w:r>
+    </w:p>
+    <w:p>
+      <w:r>
+        <w:rPr>
+          <w:b/>
+        </w:rPr>
+        <w:t xml:space="preserve">Evaluation: </w:t>
+      </w:r>
+      <w:r>
+        <w:t>Measure architecture-level rejection findings after the checkpoint and repeated changes to the enforcement design. Keep the checkpoint proportional to risk; avoid adding a large approval ceremony to routine changes.</w:t>
+      </w:r>
+    </w:p>
+    <w:p>
+      <w:pPr>
+        <w:pStyle w:val="Heading2"/>
+      </w:pPr>
+      <w:r>
+        <w:t>13.3 Deliver smaller, independently checkable increments</w:t>
+      </w:r>
+    </w:p>
+    <w:p>
+      <w:r>
+        <w:rPr>
+          <w:b/>
+        </w:rPr>
+        <w:t xml:space="preserve">Explanation: </w:t>
+      </w:r>
+      <w:r>
+        <w:t>Split complex work at coherent behavioral boundaries. Prove one boundary before relying on it in the next integration. For example, qualify funded dispatch admission, then execution supervision, then settlement. Each increment must demonstrate actual behavior, not merely contain scaffolding.</w:t>
+      </w:r>
+    </w:p>
+    <w:p>
+      <w:r>
+        <w:rPr>
+          <w:b/>
+        </w:rPr>
+        <w:t xml:space="preserve">Application: </w:t>
+      </w:r>
+      <w:r>
+        <w:t>Name the owner, interface, dependencies and evidence for each increment. Preserve a final end-to-end acceptance gate so individually passing pieces cannot be mistaken for a completed workflow.</w:t>
+      </w:r>
+    </w:p>
+    <w:p>
+      <w:r>
+        <w:rPr>
+          <w:b/>
+        </w:rPr>
+        <w:t xml:space="preserve">Connection to findings: </w:t>
+      </w:r>
+      <w:r>
+        <w:t>Addresses broad submissions with interacting defects and delayed discovery. Smaller increments are a delivery technique, not a reason to defer the complete loop indefinitely.</w:t>
+      </w:r>
+    </w:p>
+    <w:p>
+      <w:r>
+        <w:rPr>
+          <w:b/>
+        </w:rPr>
+        <w:t xml:space="preserve">Evaluation: </w:t>
+      </w:r>
+      <w:r>
+        <w:t>Measure rejection rounds per increment, cross-component regressions and completion of end-to-end milestones. Monitor fragmentation: more tiny tickets alone is not improvement.</w:t>
+      </w:r>
+    </w:p>
+    <w:p>
+      <w:pPr>
+        <w:pStyle w:val="Heading2"/>
+      </w:pPr>
+      <w:r>
+        <w:t>13.4 Require complete closure of every finding</w:t>
+      </w:r>
+    </w:p>
+    <w:p>
+      <w:r>
+        <w:rPr>
+          <w:b/>
+        </w:rPr>
+        <w:t xml:space="preserve">Explanation: </w:t>
+      </w:r>
+      <w:r>
+        <w:t>A rejection describes the underlying rule and reproduced failure. The implementer checks all affected operations, states and configurations, then provides a closure matrix mapping each finding to inspected paths, code changes and negative checks. Fixing only the reported example does not establish closure.</w:t>
+      </w:r>
+    </w:p>
+    <w:p>
+      <w:r>
+        <w:rPr>
+          <w:b/>
+        </w:rPr>
+        <w:t xml:space="preserve">Application: </w:t>
+      </w:r>
+      <w:r>
+        <w:t>For an authority bypass, enumerate all exposed mutations and trusted-only paths. For termination, cover timeout, cancellation, natural exit, crash and supported configuration. The reviewer repeats the original reproduction and checks related paths.</w:t>
+      </w:r>
+    </w:p>
+    <w:p>
+      <w:r>
+        <w:rPr>
+          <w:b/>
+        </w:rPr>
+        <w:t xml:space="preserve">Connection to findings: </w:t>
+      </w:r>
+      <w:r>
+        <w:t>Addresses recurring symptom-level fixes such as registry identity enforcement followed by unsafe configuration bypass.</w:t>
+      </w:r>
+    </w:p>
+    <w:p>
+      <w:r>
+        <w:rPr>
+          <w:b/>
+        </w:rPr>
+        <w:t xml:space="preserve">Evaluation: </w:t>
+      </w:r>
+      <w:r>
+        <w:t>Measure recurrence of the same requirement after claimed closure and missing entries in the closure matrix. Related manifestations should be grouped consistently rather than counted as unrelated successes.</w:t>
+      </w:r>
+    </w:p>
+    <w:p>
+      <w:pPr>
+        <w:pStyle w:val="Heading2"/>
+      </w:pPr>
+      <w:r>
+        <w:t>13.5 Use independent failure checks and disciplined evidence</w:t>
+      </w:r>
+    </w:p>
+    <w:p>
+      <w:r>
+        <w:rPr>
+          <w:b/>
+        </w:rPr>
+        <w:t xml:space="preserve">Explanation: </w:t>
+      </w:r>
+      <w:r>
+        <w:t>The implementer validates before submission; a separate reviewer challenges the guarantee with adverse cases. Checks must observe the relevant behavior: browser records must be asserted, and late side effects must be observed beyond their deadline. Evidence must identify the actual candidate, runner, environment and results.</w:t>
+      </w:r>
+    </w:p>
+    <w:p>
+      <w:r>
+        <w:rPr>
+          <w:b/>
+        </w:rPr>
+        <w:t xml:space="preserve">Application: </w:t>
+      </w:r>
+      <w:r>
+        <w:t>Use reviewer-owned probes for stale/revoked authority, forged evidence, conflicting outcomes, failure injection, budget boundaries and interrupted execution. Separate actual passes, failures, skips and unrun checks. Infrastructure limitations and review mistakes are recorded independently from code defects.</w:t>
+      </w:r>
+    </w:p>
+    <w:p>
+      <w:r>
+        <w:rPr>
+          <w:b/>
+        </w:rPr>
+        <w:t xml:space="preserve">Connection to findings: </w:t>
+      </w:r>
+      <w:r>
+        <w:t>Addresses passing suites that test weaker properties than the claimed guarantee and completion reports exceeding their evidence.</w:t>
+      </w:r>
+    </w:p>
+    <w:p>
+      <w:r>
+        <w:rPr>
+          <w:b/>
+        </w:rPr>
+        <w:t xml:space="preserve">Evaluation: </w:t>
+      </w:r>
+      <w:r>
+        <w:t>Measure unsupported completion claims, defects discovered after acceptance and outcomes of independent adverse-case checks. Test count alone is not an effectiveness metric.</w:t>
+      </w:r>
+    </w:p>
+    <w:p>
+      <w:pPr>
+        <w:pStyle w:val="Heading2"/>
+      </w:pPr>
+      <w:r>
+        <w:t>13.6 Pause repeated patching when the same rule fails again</w:t>
+      </w:r>
+    </w:p>
+    <w:p>
+      <w:r>
+        <w:rPr>
+          <w:b/>
+        </w:rPr>
+        <w:t xml:space="preserve">Explanation: </w:t>
+      </w:r>
+      <w:r>
+        <w:t>If a correction still violates the same invariant, stop the local patch cycle and diagnose why. Determine whether the requirement was misunderstood, the mechanism is inadequate, related paths were missed or a regression occurred. The coordinator manages this investigation rather than relying on the owner to relay another instruction.</w:t>
+      </w:r>
+    </w:p>
+    <w:p>
+      <w:r>
+        <w:rPr>
+          <w:b/>
+        </w:rPr>
+        <w:t xml:space="preserve">Application: </w:t>
+      </w:r>
+      <w:r>
+        <w:t>After a repeated failure of a claimed-closed rule, require a short reassessment and concrete corrective plan before another implementation attempt. Decide whether to clarify the contract, redesign the boundary, strengthen tests or change assignment. Preserve independent acceptance after the change.</w:t>
+      </w:r>
+    </w:p>
+    <w:p>
+      <w:r>
+        <w:rPr>
+          <w:b/>
+        </w:rPr>
+        <w:t xml:space="preserve">Connection to findings: </w:t>
+      </w:r>
+      <w:r>
+        <w:t>Addresses repeated corrections that do not improve the underlying design or verification strategy.</w:t>
+      </w:r>
+    </w:p>
+    <w:p>
+      <w:r>
+        <w:rPr>
+          <w:b/>
+        </w:rPr>
+        <w:t xml:space="preserve">Evaluation: </w:t>
+      </w:r>
+      <w:r>
+        <w:t>Measure additional rounds after recurrence, repeat issue families and routine owner handoffs. Escalate business choices to the owner; resolve ordinary technical corrections within the delivery team.</w:t>
+      </w:r>
+    </w:p>
+    <w:p>
+      <w:pPr>
+        <w:pStyle w:val="Heading1"/>
+      </w:pPr>
+      <w:r>
+        <w:t>14. Pilot and success measures for the proposed solutions</w:t>
+      </w:r>
+    </w:p>
+    <w:p>
+      <w:r>
+        <w:t>Apply the interventions to a bounded set of new tasks, recording task type, difficulty, requirement version, implementation owner and reviewer. Compare with the historical submission baseline where task scope is reasonably comparable. A small, nonrandom pilot can show useful process changes but cannot establish universal provider superiority.</w:t>
+      </w:r>
+    </w:p>
+    <w:p>
+      <w:pPr>
+        <w:pStyle w:val="ListBullet"/>
+      </w:pPr>
+      <w:r>
+        <w:t>First-pass scoped acceptance: accepted first submissions divided by independently adjudicated first submissions. Report conditional and full acceptance separately.</w:t>
+      </w:r>
+    </w:p>
+    <w:p>
+      <w:pPr>
+        <w:pStyle w:val="ListBullet"/>
+      </w:pPr>
+      <w:r>
+        <w:t>Follow-up submission proportion: follow-up rounds divided by all reviewed rounds. This measures repetition, not hours wasted.</w:t>
+      </w:r>
+    </w:p>
+    <w:p>
+      <w:pPr>
+        <w:pStyle w:val="ListBullet"/>
+      </w:pPr>
+      <w:r>
+        <w:t>Finding recurrence: rules reported again after a correction claimed closure. Distinguish related manifestations from genuinely new requirements.</w:t>
+      </w:r>
+    </w:p>
+    <w:p>
+      <w:pPr>
+        <w:pStyle w:val="ListBullet"/>
+      </w:pPr>
+      <w:r>
+        <w:t>Owner intervention: routine coordination and message-relay actions required per task, excluding business decisions and required release approval.</w:t>
+      </w:r>
+    </w:p>
+    <w:p>
+      <w:pPr>
+        <w:pStyle w:val="ListBullet"/>
+      </w:pPr>
+      <w:r>
+        <w:t>Evidence quality: unsupported completion claims and accepted changes later found to violate the applicable requirements. Preserve observation windows and uncertainty.</w:t>
+      </w:r>
+    </w:p>
+    <w:p>
+      <w:r>
+        <w:t>No numeric reduction target is claimed as achieved. Success requires lower avoidable recurrence and owner intervention without weakened acceptance, concealed failures or postponed end-to-end qualification. Hours remain outside this initial study where unavailable.</w:t>
+      </w:r>
+    </w:p>
     <w:sectPr>
       <w:pgSz w:w="12240" w:h="15840"/>
       <w:pgMar w:top="1440" w:right="1800" w:bottom="1440" w:left="1800" w:header="720" w:footer="720" w:gutter="0"/>

</xml_diff>

<commit_message>
docs(delivery): adopt shared checks, readiness screening and review recurrence rules
</commit_message>
<xml_diff>
--- a/projects/scrum-board-automation/research/Acinonyx_Rework_Research_Problem_Definition.docx
+++ b/projects/scrum-board-automation/research/Acinonyx_Rework_Research_Problem_Definition.docx
@@ -1885,6 +1885,119 @@
         <w:t>No numeric reduction target is claimed as achieved. Success requires lower avoidable recurrence and owner intervention without weakened acceptance, concealed failures or postponed end-to-end qualification. Hours remain outside this initial study where unavailable.</w:t>
       </w:r>
     </w:p>
+    <w:p>
+      <w:r>
+        <w:br w:type="page"/>
+      </w:r>
+    </w:p>
+    <w:p>
+      <w:pPr>
+        <w:pStyle w:val="Heading1"/>
+      </w:pPr>
+      <w:r>
+        <w:t>15. Additional adjustments to the proposed delivery process</w:t>
+      </w:r>
+    </w:p>
+    <w:p>
+      <w:r>
+        <w:t>These four adjustments refine the six interventions. Acceptance becomes a shared engineering target before implementation, while the final acceptance decision remains independent. They are adopted as working guidance for subsequent scoped submissions; they do not retroactively change reviewed requirements, reopen accepted work, grant runtime permissions or implement coordinator automation.</w:t>
+      </w:r>
+    </w:p>
+    <w:p>
+      <w:pPr>
+        <w:pStyle w:val="Heading2"/>
+      </w:pPr>
+      <w:r>
+        <w:t>15.1 Share acceptance checks before implementation</w:t>
+      </w:r>
+    </w:p>
+    <w:p>
+      <w:r>
+        <w:t>The reviewer supplies known acceptance and failure checks alongside the versioned requirements before coding. The implementer can run them during development. Independent review may add probes, but newly discovered requirements must be distinguished from new tests exposing an existing requirement violation.</w:t>
+      </w:r>
+    </w:p>
+    <w:p>
+      <w:r>
+        <w:t>Application: Record requirement IDs, expected outcomes, candidate/environment prerequisites and the source of each check in the task brief.</w:t>
+      </w:r>
+    </w:p>
+    <w:p>
+      <w:pPr>
+        <w:pStyle w:val="Heading2"/>
+      </w:pPr>
+      <w:r>
+        <w:t>15.2 Require readiness evidence before formal submission</w:t>
+      </w:r>
+    </w:p>
+    <w:p>
+      <w:r>
+        <w:t>The implementer supplies a short self-check against every requirement with actual command/results, candidate identity, inspected related paths and explicit gaps. The coordinator checks completeness before requesting full independent review. This checks evidence completeness, not correctness or self-approval.</w:t>
+      </w:r>
+    </w:p>
+    <w:p>
+      <w:r>
+        <w:t>Application: If incomplete, record READINESS_RETURNED with the reason. Count this separately from formal rejection and retain it in total repeat-work reporting; do not hide retries by moving them to an earlier stage.</w:t>
+      </w:r>
+    </w:p>
+    <w:p>
+      <w:pPr>
+        <w:pStyle w:val="Heading2"/>
+      </w:pPr>
+      <w:r>
+        <w:t>15.3 Make reviewer decisions challengeable</w:t>
+      </w:r>
+    </w:p>
+    <w:p>
+      <w:r>
+        <w:t>Every blocking decision cites the applicable requirement/version, a reproduction or essential missing evidence, and the operational impact. The implementer may dispute requirement applicability, facts or severity. Resolve the disagreement before another patch; unresolved business/scope choices go to the owner.</w:t>
+      </w:r>
+    </w:p>
+    <w:p>
+      <w:r>
+        <w:t>Application: Record the finding, challenge, evidence and resolution. Distinguish confirmed violation, new scope, infrastructure gap and reviewer error. A challenge does not waive a real blocker or require owner relay for ordinary technical resolution.</w:t>
+      </w:r>
+    </w:p>
+    <w:p>
+      <w:pPr>
+        <w:pStyle w:val="Heading2"/>
+      </w:pPr>
+      <w:r>
+        <w:t>15.4 Pause when a corrected requirement fails again</w:t>
+      </w:r>
+    </w:p>
+    <w:p>
+      <w:r>
+        <w:t>When a submission claiming closure still violates the same invariant, stop requesting local patches. Coordinator, implementer and reviewer reassess the mechanism, related paths, brief and checks, then agree a concrete correction plan.</w:t>
+      </w:r>
+    </w:p>
+    <w:p>
+      <w:r>
+        <w:t>Application: Record RECURRENCE_PAUSED with linked finding and corrective design. Resume only after the technical plan is settled; use proportional review depth and retain final independent acceptance.</w:t>
+      </w:r>
+    </w:p>
+    <w:p>
+      <w:pPr>
+        <w:pStyle w:val="Heading1"/>
+      </w:pPr>
+      <w:r>
+        <w:t>16. Working sequence and safeguards</w:t>
+      </w:r>
+    </w:p>
+    <w:p>
+      <w:r>
+        <w:t>Versioned brief and shared checks → proportional design checkpoint → implementation and self-check → readiness screening → independent review → complete correction or scoped acceptance. A disputed blocker is resolved before patching; recurring invariant failure triggers design reassessment.</w:t>
+      </w:r>
+    </w:p>
+    <w:p>
+      <w:r>
+        <w:t>Routine frontend changes use a short checklist. Authority, funding, isolation, evidence and recovery changes receive explicit failure-matrix and enforcement-design review. Known checks remain visible; reviewers retain independent probes. Newly introduced scope is recorded, not disguised as an original defect.</w:t>
+      </w:r>
+    </w:p>
+    <w:p>
+      <w:r>
+        <w:t>Evaluate formal rejection, readiness returns, design revisions, repeat findings, rounds to scoped acceptance and owner handoffs together. A lower rejection count accompanied by more hidden readiness returns or weaker acceptance is not improvement. These additions change process guidance and documentation only; automatic enforcement remains implementation work.</w:t>
+      </w:r>
+    </w:p>
     <w:sectPr>
       <w:pgSz w:w="12240" w:h="15840"/>
       <w:pgMar w:top="1440" w:right="1800" w:bottom="1440" w:left="1800" w:header="720" w:footer="720" w:gutter="0"/>

</xml_diff>

<commit_message>
docs(research): complete rework case study and practical delivery improvement kit
</commit_message>
<xml_diff>
--- a/projects/scrum-board-automation/research/Acinonyx_Rework_Research_Problem_Definition.docx
+++ b/projects/scrum-board-automation/research/Acinonyx_Rework_Research_Problem_Definition.docx
@@ -7,12 +7,17 @@
         <w:pStyle w:val="Title"/>
       </w:pPr>
       <w:r>
-        <w:t>Rework in Acinonyx’s Multi-Agent Development Process</w:t>
+        <w:t>Reducing Rework in Acinonyx’s Multi-Agent Development Process</w:t>
       </w:r>
     </w:p>
     <w:p>
       <w:r>
-        <w:t>Research problem definition | Editable discussion draft | 13 October 2026</w:t>
+        <w:t>Evidence-based case study and applicable delivery improvement plan</w:t>
+      </w:r>
+    </w:p>
+    <w:p>
+      <w:r>
+        <w:t>Version 1.0 | 13 October 2026 | Retrospective findings complete for the stated sample; intervention validation pending</w:t>
       </w:r>
     </w:p>
     <w:p>
@@ -20,17 +25,27 @@
         <w:pStyle w:val="Heading1"/>
       </w:pPr>
       <w:r>
-        <w:t>1. Problem statement</w:t>
+        <w:t>Executive summary</w:t>
       </w:r>
     </w:p>
     <w:p>
       <w:r>
-        <w:t>Acinonyx’s multi-agent development process repeatedly produces submissions that appear complete but do not fully satisfy independent acceptance requirements. Corrections sometimes resolve the reported example while leaving related entry points, states, configurations or failure paths insufficiently controlled. Consequently, tasks undergo repeated implementation, review, correction and retesting before scoped acceptance, while the project owner continues to coordinate handoffs manually.</w:t>
+        <w:t>Acinonyx seeks a delivery workflow in which the owner communicates goals to one coordinator, agents perform work with focused context, independent checks establish the result, and corrections and handoffs proceed without routine owner relay. The observed development process has not consistently achieved that outcome. Selected implementations repeatedly required correction before scoped acceptance.</w:t>
       </w:r>
     </w:p>
     <w:p>
       <w:r>
-        <w:t>The research problem is to determine how much repeat submission activity is documented, identify the mechanisms that cause recurring acceptance failures, and establish changes that reduce correction cycles and owner intervention without weakening engineering quality. The study does not assume that every rejected submission represents wholly incorrect code, or that every correction is attributable to an implementing agent.</w:t>
+        <w:t>Across five selected Antigravity implementation packages reviewed by Codex, nineteen submission rounds were recorded: five initial submissions and fourteen follow-ups. Seventeen submissions were rejected and two conditionally accepted. These quantities describe recorded review outcomes, not incorrect-code percentages, engineering hours or universal provider performance. Three implementation sequences subsequently involved Codex corrections, making final delivery a cross-agent outcome.</w:t>
+      </w:r>
+    </w:p>
+    <w:p>
+      <w:r>
+        <w:t>The strongest evidence supports incomplete enforcement across related paths, checks that tested weaker properties than claimed, and mechanisms that did not establish the promised guarantee. Evolving specifications, environment limitations and reviewer/reporting errors are also documented contributors. The applicable response is a shared, versioned acceptance target; early mechanism review; coherent increments; complete finding closure; independent adverse-case checks; and a recurrence pause. Four refinements make this operational: shared checks, readiness screening, challengeable reviewer decisions and explicit recurrence reassessment.</w:t>
+      </w:r>
+    </w:p>
+    <w:p>
+      <w:r>
+        <w:t>The case study recommends adopting the lightweight process immediately within authorized work, then validating it on a defined pilot. It does not claim the interventions have already reduced rejection or that automated coordinator enforcement has been implemented.</w:t>
       </w:r>
     </w:p>
     <w:p>
@@ -38,12 +53,81 @@
         <w:pStyle w:val="Heading1"/>
       </w:pPr>
       <w:r>
-        <w:t>2. Observed evidence</w:t>
+        <w:t>1. Problem and intended outcome</w:t>
       </w:r>
     </w:p>
     <w:p>
       <w:r>
-        <w:t>The initial audit examined five implementation packages: SBA-02/SBA-05, SBA-03, CC-03, CC-04 and CC-05/CC-06. Combined deliveries are counted once. Across these packages, 19 submission rounds were recorded: five initial submissions and 14 follow-up submissions. Seventeen rounds were rejected and two received conditional acceptance within their reviewed scope. All five initial recorded submissions were rejected.</w:t>
+        <w:t>The delivery process repeatedly produces submissions that appear complete but fail independent acceptance. Corrections sometimes close the reported example while leaving related operations, states or configurations open. This creates repeat implementation, review and retesting and leaves the owner coordinating messages.</w:t>
+      </w:r>
+    </w:p>
+    <w:p>
+      <w:r>
+        <w:t>The problem to solve is complete, verifiable requirement closure with fewer correction cycles and less owner intervention, while preserving independent quality controls. The objective is not zero rejection: justified rejection remains necessary when a real blocker exists. Acceptance refers to a defined development scope; it is not automatically production release.</w:t>
+      </w:r>
+    </w:p>
+    <w:p>
+      <w:pPr>
+        <w:pStyle w:val="Heading1"/>
+      </w:pPr>
+      <w:r>
+        <w:t>2. Research questions</w:t>
+      </w:r>
+    </w:p>
+    <w:p>
+      <w:r>
+        <w:t>1. How much repeat submission activity is documented in the selected packages?</w:t>
+      </w:r>
+    </w:p>
+    <w:p>
+      <w:r>
+        <w:t>2. Which failure families persist after correction, and what mechanisms explain that persistence?</w:t>
+      </w:r>
+    </w:p>
+    <w:p>
+      <w:r>
+        <w:t>3. Which findings represent original violations, specification changes, infrastructure limitations or reviewer errors?</w:t>
+      </w:r>
+    </w:p>
+    <w:p>
+      <w:r>
+        <w:t>4. Which concrete workflow controls could prevent recurrence without weakening acceptance?</w:t>
+      </w:r>
+    </w:p>
+    <w:p>
+      <w:r>
+        <w:t>5. How will improvements be measured without moving or hiding repeat work upstream?</w:t>
+      </w:r>
+    </w:p>
+    <w:p>
+      <w:pPr>
+        <w:pStyle w:val="Heading1"/>
+      </w:pPr>
+      <w:r>
+        <w:t>3. Scope, sources and method</w:t>
+      </w:r>
+    </w:p>
+    <w:p>
+      <w:r>
+        <w:t>The corpus was collected from the Acinonyx repository after fetching current origin branch heads. It preserves 186 reachable commits and patches, three GitHub PRs with available reviews/conversations, 138 document snapshots, 21 uploaded transcripts and 188 existing evidence files, plus available issues, Actions metadata and repository events. Five hundred and sixty original source-file hashes were checked. Later analysis files are additions, not part of that original collection count.</w:t>
+      </w:r>
+    </w:p>
+    <w:p>
+      <w:r>
+        <w:t>The review denominator is five selected security-heavy implementation packages, not every repository task. Combined SBA-02/05 and CC-05/06 deliveries count once per review round. A submission is a candidate presented for review, not every commit or push. Conditional acceptance counts only within its stated scope. Design/discovery decisions are not implementation acceptance. Author tests are not independent review.</w:t>
+      </w:r>
+    </w:p>
+    <w:p>
+      <w:r>
+        <w:t>Method: construct candidate-linked sequences; associate rejection findings with later corrections; identify recurring rule families; preserve exact excerpts and distinguish observation from causal interpretation. Thirteen remediation candidates and eight overlapping issue families were selected for detailed tracing. Uploaded transcript pointers are supplemental claims, not automatically measured evidence. No unavailable hours are estimated.</w:t>
+      </w:r>
+    </w:p>
+    <w:p>
+      <w:pPr>
+        <w:pStyle w:val="Heading1"/>
+      </w:pPr>
+      <w:r>
+        <w:t>4. Baseline results</w:t>
       </w:r>
     </w:p>
     <w:tbl>
@@ -53,15 +137,16 @@
         <w:tblLook w:firstColumn="1" w:firstRow="1" w:lastColumn="0" w:lastRow="0" w:noHBand="0" w:noVBand="1" w:val="04A0"/>
       </w:tblPr>
       <w:tblGrid>
-        <w:gridCol w:w="2160"/>
-        <w:gridCol w:w="2160"/>
-        <w:gridCol w:w="2160"/>
-        <w:gridCol w:w="2160"/>
+        <w:gridCol w:w="1728"/>
+        <w:gridCol w:w="1728"/>
+        <w:gridCol w:w="1728"/>
+        <w:gridCol w:w="1728"/>
+        <w:gridCol w:w="1728"/>
       </w:tblGrid>
       <w:tr>
         <w:tc>
           <w:tcPr>
-            <w:tcW w:type="dxa" w:w="2160"/>
+            <w:tcW w:type="dxa" w:w="1728"/>
           </w:tcPr>
           <w:p>
             <w:r>
@@ -71,7 +156,7 @@
         </w:tc>
         <w:tc>
           <w:tcPr>
-            <w:tcW w:type="dxa" w:w="2160"/>
+            <w:tcW w:type="dxa" w:w="1728"/>
           </w:tcPr>
           <w:p>
             <w:r>
@@ -81,7 +166,7 @@
         </w:tc>
         <w:tc>
           <w:tcPr>
-            <w:tcW w:type="dxa" w:w="2160"/>
+            <w:tcW w:type="dxa" w:w="1728"/>
           </w:tcPr>
           <w:p>
             <w:r>
@@ -91,11 +176,21 @@
         </w:tc>
         <w:tc>
           <w:tcPr>
-            <w:tcW w:type="dxa" w:w="2160"/>
+            <w:tcW w:type="dxa" w:w="1728"/>
           </w:tcPr>
           <w:p>
             <w:r>
-              <w:t>Rejections</w:t>
+              <w:t>Rejected</w:t>
+            </w:r>
+          </w:p>
+        </w:tc>
+        <w:tc>
+          <w:tcPr>
+            <w:tcW w:type="dxa" w:w="1728"/>
+          </w:tcPr>
+          <w:p>
+            <w:r>
+              <w:t>Outcome in counted sequence</w:t>
             </w:r>
           </w:p>
         </w:tc>
@@ -103,17 +198,17 @@
       <w:tr>
         <w:tc>
           <w:tcPr>
-            <w:tcW w:type="dxa" w:w="2160"/>
+            <w:tcW w:type="dxa" w:w="1728"/>
           </w:tcPr>
           <w:p>
             <w:r>
-              <w:t>SBA-02/SBA-05</w:t>
+              <w:t>SBA-02/05</w:t>
             </w:r>
           </w:p>
         </w:tc>
         <w:tc>
           <w:tcPr>
-            <w:tcW w:type="dxa" w:w="2160"/>
+            <w:tcW w:type="dxa" w:w="1728"/>
           </w:tcPr>
           <w:p>
             <w:r>
@@ -123,7 +218,7 @@
         </w:tc>
         <w:tc>
           <w:tcPr>
-            <w:tcW w:type="dxa" w:w="2160"/>
+            <w:tcW w:type="dxa" w:w="1728"/>
           </w:tcPr>
           <w:p>
             <w:r>
@@ -133,7 +228,7 @@
         </w:tc>
         <w:tc>
           <w:tcPr>
-            <w:tcW w:type="dxa" w:w="2160"/>
+            <w:tcW w:type="dxa" w:w="1728"/>
           </w:tcPr>
           <w:p>
             <w:r>
@@ -141,11 +236,21 @@
             </w:r>
           </w:p>
         </w:tc>
+        <w:tc>
+          <w:tcPr>
+            <w:tcW w:type="dxa" w:w="1728"/>
+          </w:tcPr>
+          <w:p>
+            <w:r>
+              <w:t>Conditional development acceptance</w:t>
+            </w:r>
+          </w:p>
+        </w:tc>
       </w:tr>
       <w:tr>
         <w:tc>
           <w:tcPr>
-            <w:tcW w:type="dxa" w:w="2160"/>
+            <w:tcW w:type="dxa" w:w="1728"/>
           </w:tcPr>
           <w:p>
             <w:r>
@@ -155,7 +260,7 @@
         </w:tc>
         <w:tc>
           <w:tcPr>
-            <w:tcW w:type="dxa" w:w="2160"/>
+            <w:tcW w:type="dxa" w:w="1728"/>
           </w:tcPr>
           <w:p>
             <w:r>
@@ -165,7 +270,7 @@
         </w:tc>
         <w:tc>
           <w:tcPr>
-            <w:tcW w:type="dxa" w:w="2160"/>
+            <w:tcW w:type="dxa" w:w="1728"/>
           </w:tcPr>
           <w:p>
             <w:r>
@@ -175,7 +280,7 @@
         </w:tc>
         <w:tc>
           <w:tcPr>
-            <w:tcW w:type="dxa" w:w="2160"/>
+            <w:tcW w:type="dxa" w:w="1728"/>
           </w:tcPr>
           <w:p>
             <w:r>
@@ -183,11 +288,21 @@
             </w:r>
           </w:p>
         </w:tc>
+        <w:tc>
+          <w:tcPr>
+            <w:tcW w:type="dxa" w:w="1728"/>
+          </w:tcPr>
+          <w:p>
+            <w:r>
+              <w:t>Later Codex correction; standalone final package acceptance not counted</w:t>
+            </w:r>
+          </w:p>
+        </w:tc>
       </w:tr>
       <w:tr>
         <w:tc>
           <w:tcPr>
-            <w:tcW w:type="dxa" w:w="2160"/>
+            <w:tcW w:type="dxa" w:w="1728"/>
           </w:tcPr>
           <w:p>
             <w:r>
@@ -197,7 +312,7 @@
         </w:tc>
         <w:tc>
           <w:tcPr>
-            <w:tcW w:type="dxa" w:w="2160"/>
+            <w:tcW w:type="dxa" w:w="1728"/>
           </w:tcPr>
           <w:p>
             <w:r>
@@ -207,7 +322,7 @@
         </w:tc>
         <w:tc>
           <w:tcPr>
-            <w:tcW w:type="dxa" w:w="2160"/>
+            <w:tcW w:type="dxa" w:w="1728"/>
           </w:tcPr>
           <w:p>
             <w:r>
@@ -217,7 +332,7 @@
         </w:tc>
         <w:tc>
           <w:tcPr>
-            <w:tcW w:type="dxa" w:w="2160"/>
+            <w:tcW w:type="dxa" w:w="1728"/>
           </w:tcPr>
           <w:p>
             <w:r>
@@ -225,11 +340,21 @@
             </w:r>
           </w:p>
         </w:tc>
+        <w:tc>
+          <w:tcPr>
+            <w:tcW w:type="dxa" w:w="1728"/>
+          </w:tcPr>
+          <w:p>
+            <w:r>
+              <w:t>Later Codex correction independently accepted separately</w:t>
+            </w:r>
+          </w:p>
+        </w:tc>
       </w:tr>
       <w:tr>
         <w:tc>
           <w:tcPr>
-            <w:tcW w:type="dxa" w:w="2160"/>
+            <w:tcW w:type="dxa" w:w="1728"/>
           </w:tcPr>
           <w:p>
             <w:r>
@@ -239,7 +364,7 @@
         </w:tc>
         <w:tc>
           <w:tcPr>
-            <w:tcW w:type="dxa" w:w="2160"/>
+            <w:tcW w:type="dxa" w:w="1728"/>
           </w:tcPr>
           <w:p>
             <w:r>
@@ -249,7 +374,7 @@
         </w:tc>
         <w:tc>
           <w:tcPr>
-            <w:tcW w:type="dxa" w:w="2160"/>
+            <w:tcW w:type="dxa" w:w="1728"/>
           </w:tcPr>
           <w:p>
             <w:r>
@@ -259,7 +384,7 @@
         </w:tc>
         <w:tc>
           <w:tcPr>
-            <w:tcW w:type="dxa" w:w="2160"/>
+            <w:tcW w:type="dxa" w:w="1728"/>
           </w:tcPr>
           <w:p>
             <w:r>
@@ -267,21 +392,31 @@
             </w:r>
           </w:p>
         </w:tc>
+        <w:tc>
+          <w:tcPr>
+            <w:tcW w:type="dxa" w:w="1728"/>
+          </w:tcPr>
+          <w:p>
+            <w:r>
+              <w:t>Conditional synthetic-only acceptance</w:t>
+            </w:r>
+          </w:p>
+        </w:tc>
       </w:tr>
       <w:tr>
         <w:tc>
           <w:tcPr>
-            <w:tcW w:type="dxa" w:w="2160"/>
+            <w:tcW w:type="dxa" w:w="1728"/>
           </w:tcPr>
           <w:p>
             <w:r>
-              <w:t>CC-05/CC-06</w:t>
+              <w:t>CC-05/06</w:t>
             </w:r>
           </w:p>
         </w:tc>
         <w:tc>
           <w:tcPr>
-            <w:tcW w:type="dxa" w:w="2160"/>
+            <w:tcW w:type="dxa" w:w="1728"/>
           </w:tcPr>
           <w:p>
             <w:r>
@@ -291,7 +426,7 @@
         </w:tc>
         <w:tc>
           <w:tcPr>
-            <w:tcW w:type="dxa" w:w="2160"/>
+            <w:tcW w:type="dxa" w:w="1728"/>
           </w:tcPr>
           <w:p>
             <w:r>
@@ -301,7 +436,7 @@
         </w:tc>
         <w:tc>
           <w:tcPr>
-            <w:tcW w:type="dxa" w:w="2160"/>
+            <w:tcW w:type="dxa" w:w="1728"/>
           </w:tcPr>
           <w:p>
             <w:r>
@@ -309,11 +444,21 @@
             </w:r>
           </w:p>
         </w:tc>
+        <w:tc>
+          <w:tcPr>
+            <w:tcW w:type="dxa" w:w="1728"/>
+          </w:tcPr>
+          <w:p>
+            <w:r>
+              <w:t>Later Codex correction partially accepted; runtime pending</w:t>
+            </w:r>
+          </w:p>
+        </w:tc>
       </w:tr>
       <w:tr>
         <w:tc>
           <w:tcPr>
-            <w:tcW w:type="dxa" w:w="2160"/>
+            <w:tcW w:type="dxa" w:w="1728"/>
           </w:tcPr>
           <w:p>
             <w:r>
@@ -323,7 +468,7 @@
         </w:tc>
         <w:tc>
           <w:tcPr>
-            <w:tcW w:type="dxa" w:w="2160"/>
+            <w:tcW w:type="dxa" w:w="1728"/>
           </w:tcPr>
           <w:p>
             <w:r>
@@ -333,7 +478,7 @@
         </w:tc>
         <w:tc>
           <w:tcPr>
-            <w:tcW w:type="dxa" w:w="2160"/>
+            <w:tcW w:type="dxa" w:w="1728"/>
           </w:tcPr>
           <w:p>
             <w:r>
@@ -343,7 +488,7 @@
         </w:tc>
         <w:tc>
           <w:tcPr>
-            <w:tcW w:type="dxa" w:w="2160"/>
+            <w:tcW w:type="dxa" w:w="1728"/>
           </w:tcPr>
           <w:p>
             <w:r>
@@ -351,11 +496,26 @@
             </w:r>
           </w:p>
         </w:tc>
+        <w:tc>
+          <w:tcPr>
+            <w:tcW w:type="dxa" w:w="1728"/>
+          </w:tcPr>
+          <w:p>
+            <w:r>
+              <w:t>Selected retrospective sequence</w:t>
+            </w:r>
+          </w:p>
+        </w:tc>
       </w:tr>
     </w:tbl>
     <w:p>
       <w:r>
-        <w:t>Follow-up submissions account for 14/19 = 73.7% of recorded rounds. The rejection fraction is 17/19 = 89.5%. Neither figure measures engineering hours, percentage of code incorrect, or wasted effort. Three package sequences subsequently involved Codex corrective work; those corrections are not counted as Antigravity-only completed delivery cycles.</w:t>
+        <w:t>First-recorded-review acceptance: 0/5. Rejected submissions: 17/19 = 89.5%. Follow-up round proportion: 14/19 = 73.7%. These are descriptive fractions. They do not establish a statistically representative error margin or 73.7% wasted effort. The selected sequences are incomplete for some final outcomes; do not compare nineteen historical rounds with a fully accepted future cohort as if endpoint coverage were equal.</w:t>
+      </w:r>
+    </w:p>
+    <w:p>
+      <w:r>
+        <w:t>The Codex comparison is not balanced: two corrective packages received first-recorded-review acceptance and one further package received partial offline acceptance. Corrective tasks benefit from prior failure analysis and differ from original implementation. Remaining Codex recovery fixes and pending runtime review rule out a general zero-defect claim.</w:t>
       </w:r>
     </w:p>
     <w:p>
@@ -363,7 +523,7 @@
         <w:pStyle w:val="Heading1"/>
       </w:pPr>
       <w:r>
-        <w:t>3. Preliminary diagnostic findings</w:t>
+        <w:t>5. Diagnostic findings and causal interpretation</w:t>
       </w:r>
     </w:p>
     <w:p>
@@ -371,12 +531,12 @@
         <w:pStyle w:val="Heading2"/>
       </w:pPr>
       <w:r>
-        <w:t>Incomplete boundary fixes</w:t>
+        <w:t>5.1 Incomplete boundary closure</w:t>
       </w:r>
     </w:p>
     <w:p>
       <w:r>
-        <w:t>Planning authorization weaknesses persisted across successive revisions. Fixing one call path or reproducer did not always enforce the same rule across all affected operations.</w:t>
+        <w:t>Planning authorization appeared across four review observations. Active-policy preservation appeared across two. Null reviewer removal and alternate authorization paths escaped earlier corrections. The supported diagnosis is incomplete enforcement of a shared invariant, rather than all code being wrong. The evidence does not reveal the model’s internal reasoning.</w:t>
       </w:r>
     </w:p>
     <w:p>
@@ -384,12 +544,12 @@
         <w:pStyle w:val="Heading2"/>
       </w:pPr>
       <w:r>
-        <w:t>Insufficient adverse-case checks</w:t>
+        <w:t>5.2 Tests measured a weaker property</w:t>
       </w:r>
     </w:p>
     <w:p>
       <w:r>
-        <w:t>Recorded examples include checking for a delayed side effect before its deadline, claiming browser records without DOM assertions, and treating printed test-like output as evidence of actual tests.</w:t>
+        <w:t>A forged receipt test expected promotion under trusted scope; a delayed-effect check ended too early; a browser report asserted populated tickets without checking cards; stdout resembling pytest output became signed passing evidence. These examples explain how passing suites and rejection can coexist. The remedy is a test that can falsify the actual claimed guarantee.</w:t>
       </w:r>
     </w:p>
     <w:p>
@@ -397,12 +557,12 @@
         <w:pStyle w:val="Heading2"/>
       </w:pPr>
       <w:r>
-        <w:t>Mechanism–guarantee mismatch</w:t>
+        <w:t>5.3 Mechanism did not establish the guarantee</w:t>
       </w:r>
     </w:p>
     <w:p>
       <w:r>
-        <w:t>Cooperative stop signals, capability declarations, class allowlists, worktrees and signatures were sometimes relied on for guarantees they did not independently establish.</w:t>
+        <w:t>CC-04 progressed from cooperative execution control to declared capability, then exact-class registration, then configuration qualification. Physical execution still survived in intermediate candidates. A valid uncertainty record is not confirmed termination; a worktree is not isolation; a signature cannot turn an unmeasured claim into truth.</w:t>
       </w:r>
     </w:p>
     <w:p>
@@ -410,12 +570,12 @@
         <w:pStyle w:val="Heading2"/>
       </w:pPr>
       <w:r>
-        <w:t>Incomplete historical integration coverage</w:t>
+        <w:t>5.4 Historical and concurrent integration gaps</w:t>
       </w:r>
     </w:p>
     <w:p>
       <w:r>
-        <w:t>Success on fresh database schemas did not establish safe upgrades for already-shipped schemas and migration ledgers.</w:t>
+        <w:t>Fresh database behavior did not cover previous migration ledgers. Separate policy checks could race launch authorization. These are boundary conditions that happy-path tests do not establish. Upgrade chains and competing operations must be tested against the same invariant.</w:t>
       </w:r>
     </w:p>
     <w:p>
@@ -423,12 +583,12 @@
         <w:pStyle w:val="Heading2"/>
       </w:pPr>
       <w:r>
-        <w:t>Requirements and evidence standards evolving during delivery</w:t>
+        <w:t>5.5 Specification and environment contributors</w:t>
       </w:r>
     </w:p>
     <w:p>
       <w:r>
-        <w:t>Review progressively clarified contract details and supported scope. Some additional work may therefore reflect specification development rather than an original implementation violation.</w:t>
+        <w:t>Reviews clarified version binding, strict types, supported adapter scope and required evidence. Initial omissions cannot all be attributed to the implementer without comparing the requirement baseline. Missing Docker is infrastructure; claiming its tests ran is a reporting error. Context quality and concurrency are plausible additional contributors that need prospective measurement.</w:t>
       </w:r>
     </w:p>
     <w:p>
@@ -436,12 +596,12 @@
         <w:pStyle w:val="Heading2"/>
       </w:pPr>
       <w:r>
-        <w:t>Continued owner-mediated coordination</w:t>
+        <w:t>5.6 Review accountability and owner dependency</w:t>
       </w:r>
     </w:p>
     <w:p>
       <w:r>
-        <w:t>Uploaded transcripts document repeated manual handoffs. This establishes coordination burden, but does not by itself prove that handoffs caused particular code defects.</w:t>
+        <w:t>The revised Antigravity review of Codex CC-05/06 withdrew incorrect count and container-verification claims. Reviewers can therefore introduce error as well as detect it. Transcripts establish repeated owner-mediated handoffs, but not a causal percentage for code defects. Reviewer consistency, shared agent assumptions, premature completion incentives and proportionality must be controlled on both sides.</w:t>
       </w:r>
     </w:p>
     <w:p>
@@ -449,47 +609,90 @@
         <w:pStyle w:val="Heading1"/>
       </w:pPr>
       <w:r>
-        <w:t>4. Research questions</w:t>
+        <w:t>6. Proposed solution: one shared acceptance workflow</w:t>
+      </w:r>
+    </w:p>
+    <w:p>
+      <w:r>
+        <w:t>The six interventions and four refinements form one process; automated enforcement is its future implementation, not a separate remedy or an existing capability.</w:t>
       </w:r>
     </w:p>
     <w:p>
       <w:pPr>
-        <w:pStyle w:val="ListNumber"/>
+        <w:pStyle w:val="Heading2"/>
       </w:pPr>
       <w:r>
-        <w:t>How many initial submissions, follow-up submissions and recurring issue families can be reconstructed for each task?</w:t>
+        <w:t>6.1 Versioned acceptance contract and shared checks</w:t>
+      </w:r>
+    </w:p>
+    <w:p>
+      <w:r>
+        <w:t>Coordinator and reviewer translate the goal into requirement IDs, invariant statements, permitted scope, code baseline, known positive/adverse checks and evidence expectations. The implementer confirms understanding. Record additions as scope changes; a new test exposing an existing rule is not automatically a new requirement. Owner approval is needed for relevant business changes, not every technical clarification.</w:t>
       </w:r>
     </w:p>
     <w:p>
       <w:pPr>
-        <w:pStyle w:val="ListNumber"/>
+        <w:pStyle w:val="Heading2"/>
       </w:pPr>
       <w:r>
-        <w:t>Which corrections address original requirement violations, incomplete previous fixes, later requirement changes, infrastructure gaps or review/reporting errors?</w:t>
+        <w:t>6.2 Early review of the enforcement mechanism</w:t>
+      </w:r>
+    </w:p>
+    <w:p>
+      <w:r>
+        <w:t>Before substantial code, explain how critical rules hold under failure. Reviewer challenges the boundary for identity, funds, isolation, evidence and recovery. A short frontend task uses a brief check; critical control work uses a failure matrix. Resolve mechanism mismatch before implementation, rather than add lengthy design bureaucracy to every task.</w:t>
       </w:r>
     </w:p>
     <w:p>
       <w:pPr>
-        <w:pStyle w:val="ListNumber"/>
+        <w:pStyle w:val="Heading2"/>
       </w:pPr>
       <w:r>
-        <w:t>Which engineering boundaries recur most frequently across rejection cycles?</w:t>
+        <w:t>6.3 Coherent increments with end-to-end accountability</w:t>
+      </w:r>
+    </w:p>
+    <w:p>
+      <w:r>
+        <w:t>Prove one meaningful behavior at a time, with named owner and interface. Each increment demonstrates real behavior. Retain a final integration gate and the approval-ready workflow objective; smaller tickets must not become an excuse for indefinite component work.</w:t>
       </w:r>
     </w:p>
     <w:p>
       <w:pPr>
-        <w:pStyle w:val="ListNumber"/>
+        <w:pStyle w:val="Heading2"/>
       </w:pPr>
       <w:r>
-        <w:t>What submission and verification practices would prevent recurrence while retaining independent acceptance?</w:t>
+        <w:t>6.4 Complete finding closure and readiness screening</w:t>
+      </w:r>
+    </w:p>
+    <w:p>
+      <w:r>
+        <w:t>Implementer maps each requirement/finding to all affected operations, states/configurations, changed or inspected paths, actual checks and remaining gaps. Coordinator checks completeness before full review. A readiness return is counted, not hidden. Screening does not certify correctness or authorize self-approval.</w:t>
       </w:r>
     </w:p>
     <w:p>
       <w:pPr>
-        <w:pStyle w:val="ListNumber"/>
+        <w:pStyle w:val="Heading2"/>
       </w:pPr>
       <w:r>
-        <w:t>How can the coordinator reduce routine project-owner intervention?</w:t>
+        <w:t>6.5 Independent failure checks and challengeable decisions</w:t>
+      </w:r>
+    </w:p>
+    <w:p>
+      <w:r>
+        <w:t>Reviewer tests adverse cases independently on the exact candidate and qualified environment. Each blocker cites the requirement/version, reproduction or missing essential evidence, impact and closure test. Implementer can challenge facts, applicability or severity. Resolve technical disagreement before another patch; unresolved business/scope decisions go to the owner. Optional improvements do not silently become blockers.</w:t>
+      </w:r>
+    </w:p>
+    <w:p>
+      <w:pPr>
+        <w:pStyle w:val="Heading2"/>
+      </w:pPr>
+      <w:r>
+        <w:t>6.6 Recurrence pause and concrete corrective plan</w:t>
+      </w:r>
+    </w:p>
+    <w:p>
+      <w:r>
+        <w:t>When a claimed-closed invariant fails again, pause the local patch cycle. Reassess mechanism, paths, brief and tests jointly. Record a corrective plan and then resume. Do not waive a real defect because retries are costly. Final acceptance remains independent, and release authority remains unchanged.</w:t>
       </w:r>
     </w:p>
     <w:p>
@@ -497,17 +700,216 @@
         <w:pStyle w:val="Heading1"/>
       </w:pPr>
       <w:r>
-        <w:t>5. Evidence base and method</w:t>
+        <w:t>7. Responsibilities and decision rules</w:t>
       </w:r>
     </w:p>
+    <w:tbl>
+      <w:tblPr>
+        <w:tblStyle w:val="LightShading-Accent1"/>
+        <w:tblW w:type="auto" w:w="0"/>
+        <w:tblLook w:firstColumn="1" w:firstRow="1" w:lastColumn="0" w:lastRow="0" w:noHBand="0" w:noVBand="1" w:val="04A0"/>
+      </w:tblPr>
+      <w:tblGrid>
+        <w:gridCol w:w="2880"/>
+        <w:gridCol w:w="2880"/>
+        <w:gridCol w:w="2880"/>
+      </w:tblGrid>
+      <w:tr>
+        <w:tc>
+          <w:tcPr>
+            <w:tcW w:type="dxa" w:w="2880"/>
+          </w:tcPr>
+          <w:p>
+            <w:r>
+              <w:t>Role</w:t>
+            </w:r>
+          </w:p>
+        </w:tc>
+        <w:tc>
+          <w:tcPr>
+            <w:tcW w:type="dxa" w:w="2880"/>
+          </w:tcPr>
+          <w:p>
+            <w:r>
+              <w:t>Responsibility</w:t>
+            </w:r>
+          </w:p>
+        </w:tc>
+        <w:tc>
+          <w:tcPr>
+            <w:tcW w:type="dxa" w:w="2880"/>
+          </w:tcPr>
+          <w:p>
+            <w:r>
+              <w:t>Must not do</w:t>
+            </w:r>
+          </w:p>
+        </w:tc>
+      </w:tr>
+      <w:tr>
+        <w:tc>
+          <w:tcPr>
+            <w:tcW w:type="dxa" w:w="2880"/>
+          </w:tcPr>
+          <w:p>
+            <w:r>
+              <w:t>Owner</w:t>
+            </w:r>
+          </w:p>
+        </w:tc>
+        <w:tc>
+          <w:tcPr>
+            <w:tcW w:type="dxa" w:w="2880"/>
+          </w:tcPr>
+          <w:p>
+            <w:r>
+              <w:t>Business direction, scope decisions and required release approval</w:t>
+            </w:r>
+          </w:p>
+        </w:tc>
+        <w:tc>
+          <w:tcPr>
+            <w:tcW w:type="dxa" w:w="2880"/>
+          </w:tcPr>
+          <w:p>
+            <w:r>
+              <w:t>Act as routine message courier</w:t>
+            </w:r>
+          </w:p>
+        </w:tc>
+      </w:tr>
+      <w:tr>
+        <w:tc>
+          <w:tcPr>
+            <w:tcW w:type="dxa" w:w="2880"/>
+          </w:tcPr>
+          <w:p>
+            <w:r>
+              <w:t>Coordinator</w:t>
+            </w:r>
+          </w:p>
+        </w:tc>
+        <w:tc>
+          <w:tcPr>
+            <w:tcW w:type="dxa" w:w="2880"/>
+          </w:tcPr>
+          <w:p>
+            <w:r>
+              <w:t>Brief/context integrity, prerequisites, handoffs, readiness and record completeness</w:t>
+            </w:r>
+          </w:p>
+        </w:tc>
+        <w:tc>
+          <w:tcPr>
+            <w:tcW w:type="dxa" w:w="2880"/>
+          </w:tcPr>
+          <w:p>
+            <w:r>
+              <w:t>Treat metadata completeness as proof of correctness</w:t>
+            </w:r>
+          </w:p>
+        </w:tc>
+      </w:tr>
+      <w:tr>
+        <w:tc>
+          <w:tcPr>
+            <w:tcW w:type="dxa" w:w="2880"/>
+          </w:tcPr>
+          <w:p>
+            <w:r>
+              <w:t>Implementer</w:t>
+            </w:r>
+          </w:p>
+        </w:tc>
+        <w:tc>
+          <w:tcPr>
+            <w:tcW w:type="dxa" w:w="2880"/>
+          </w:tcPr>
+          <w:p>
+            <w:r>
+              <w:t>Scoped change, pre-submission checks and complete closure evidence</w:t>
+            </w:r>
+          </w:p>
+        </w:tc>
+        <w:tc>
+          <w:tcPr>
+            <w:tcW w:type="dxa" w:w="2880"/>
+          </w:tcPr>
+          <w:p>
+            <w:r>
+              <w:t>Approve its own candidate</w:t>
+            </w:r>
+          </w:p>
+        </w:tc>
+      </w:tr>
+      <w:tr>
+        <w:tc>
+          <w:tcPr>
+            <w:tcW w:type="dxa" w:w="2880"/>
+          </w:tcPr>
+          <w:p>
+            <w:r>
+              <w:t>Reviewer/verifier</w:t>
+            </w:r>
+          </w:p>
+        </w:tc>
+        <w:tc>
+          <w:tcPr>
+            <w:tcW w:type="dxa" w:w="2880"/>
+          </w:tcPr>
+          <w:p>
+            <w:r>
+              <w:t>Independent evidence and justified scoped decisions</w:t>
+            </w:r>
+          </w:p>
+        </w:tc>
+        <w:tc>
+          <w:tcPr>
+            <w:tcW w:type="dxa" w:w="2880"/>
+          </w:tcPr>
+          <w:p>
+            <w:r>
+              <w:t>Introduce undisclosed requirements as original defects or claim unrun tests</w:t>
+            </w:r>
+          </w:p>
+        </w:tc>
+      </w:tr>
+      <w:tr>
+        <w:tc>
+          <w:tcPr>
+            <w:tcW w:type="dxa" w:w="2880"/>
+          </w:tcPr>
+          <w:p>
+            <w:r>
+              <w:t>Integration owner</w:t>
+            </w:r>
+          </w:p>
+        </w:tc>
+        <w:tc>
+          <w:tcPr>
+            <w:tcW w:type="dxa" w:w="2880"/>
+          </w:tcPr>
+          <w:p>
+            <w:r>
+              <w:t>Preserve exact candidate/base and concurrent work; recheck resulting candidate</w:t>
+            </w:r>
+          </w:p>
+        </w:tc>
+        <w:tc>
+          <w:tcPr>
+            <w:tcW w:type="dxa" w:w="2880"/>
+          </w:tcPr>
+          <w:p>
+            <w:r>
+              <w:t>Transfer acceptance to changed integrated code automatically</w:t>
+            </w:r>
+          </w:p>
+        </w:tc>
+      </w:tr>
+    </w:tbl>
     <w:p>
       <w:r>
-        <w:t>The collected corpus contains 186 reachable Git commits and patches, three GitHub pull requests with available reviews and conversations, 138 document snapshots, 21 uploaded transcripts and 188 existing evidence files, supplemented by available issue, Actions and repository-event metadata. These are repository-wide sources, not 186 tasks or 186 rework events. Original collection hashes were verified. Git history is preserved in a private repository bundle.</w:t>
-      </w:r>
-    </w:p>
-    <w:p>
-      <w:r>
-        <w:t>The method is to reconstruct candidate-linked task timelines, associate review findings with subsequent patches, and classify recurring mechanisms. Thirteen selected remediation commits and eight recurring issue families have been identified. These are initial, overlapping selections, not an exhaustive defect census. Transcripts support reported sequences; measured runner records and candidate-specific reviews are distinguished from agent claims. Working hours are excluded where unavailable.</w:t>
+        <w:t>Decision records distinguish accepted scope, original violation, new scope, infrastructure gap, reviewer/reporting error and incomplete closure. Review may require essential missing evidence without an executable reproduction, but must explain why that evidence is necessary. If no independent reviewer is available, record pending review; author tests do not close that gap.</w:t>
       </w:r>
     </w:p>
     <w:p>
@@ -515,47 +917,32 @@
         <w:pStyle w:val="Heading1"/>
       </w:pPr>
       <w:r>
-        <w:t>6. Limitations</w:t>
+        <w:t>8. Practical records and templates</w:t>
       </w:r>
     </w:p>
     <w:p>
-      <w:pPr>
-        <w:pStyle w:val="ListBullet"/>
-      </w:pPr>
       <w:r>
-        <w:t>The selected packages are demanding coordinator/security tasks and do not constitute a representative model benchmark.</w:t>
+        <w:t>Task brief: task/package ID; one owner; separate reviewer; repository/base SHA; allowed files; requirement version; invariants; known checks; environment prerequisites; dependencies; limits and scope-change log.</w:t>
       </w:r>
     </w:p>
     <w:p>
-      <w:pPr>
-        <w:pStyle w:val="ListBullet"/>
-      </w:pPr>
       <w:r>
-        <w:t>Git authors do not necessarily identify the agent responsible; timestamps do not establish hours worked or exact push times.</w:t>
+        <w:t>Submission: immutable candidate/base; author identity; requirement/finding coverage; actual commands and outcomes; evidence locations/digests; failures/skips; uncertainty; related paths inspected; remaining limitations.</w:t>
       </w:r>
     </w:p>
     <w:p>
-      <w:pPr>
-        <w:pStyle w:val="ListBullet"/>
-      </w:pPr>
       <w:r>
-        <w:t>Unavailable IDE sessions, uncommitted desktop work, deleted records and provider billing are not fully captured.</w:t>
+        <w:t>Finding: ID and rule family; candidate; requirement/version; severity; reproduction or missing essential evidence; expected/observed behavior; impact; classification; dispute and resolution; required closure checks.</w:t>
       </w:r>
     </w:p>
     <w:p>
-      <w:pPr>
-        <w:pStyle w:val="ListBullet"/>
-      </w:pPr>
       <w:r>
-        <w:t>Conditional acceptance is limited to the reviewed scope and does not establish production or end-to-end automation readiness.</w:t>
+        <w:t>Closure: finding ID; related entry points/states/configuration; mechanism change; tests of original and related failure paths; new candidate; reviewer disposition.</w:t>
       </w:r>
     </w:p>
     <w:p>
-      <w:pPr>
-        <w:pStyle w:val="ListBullet"/>
-      </w:pPr>
       <w:r>
-        <w:t>The study does not assign a causal percentage to any provider or equate repeated submissions with wholly wasted work.</w:t>
+        <w:t>Readiness-return and recurrence-pause labels are prospective record categories, not deployed PM FSM/API states. Use documents/manual records initially; do not introduce new live state transitions without compatible contracts.</w:t>
       </w:r>
     </w:p>
     <w:p>
@@ -563,12 +950,37 @@
         <w:pStyle w:val="Heading1"/>
       </w:pPr>
       <w:r>
-        <w:t>7. Intended research outcome</w:t>
+        <w:t>9. Adoption and automation roadmap</w:t>
       </w:r>
     </w:p>
     <w:p>
       <w:r>
-        <w:t>Produce a defensible account of repeat submission activity and recurring failure mechanisms, then evaluate practical interventions: versioned acceptance contracts, early enforcement-design review, full finding-closure matrices, reviewer-owned adverse-case tests and durable automated handoffs. Success is fewer correction cycles and less owner coordination while preserving trustworthy acceptance.</w:t>
+        <w:t>1. Adopt the checklist for the next scoped task. Produce an agreed brief and shared checks; keep the original acceptance standard.</w:t>
+      </w:r>
+    </w:p>
+    <w:p>
+      <w:r>
+        <w:t>2. Run a small connected task through implementation, readiness and independent review. Record each return, challenge and correction, including work discovered before formal review.</w:t>
+      </w:r>
+    </w:p>
+    <w:p>
+      <w:r>
+        <w:t>3. Extend to a five-package pilot, grouping tasks by frontend, backend/data and critical-control risk. Record incomplete tasks as pending; do not drop them from reporting.</w:t>
+      </w:r>
+    </w:p>
+    <w:p>
+      <w:r>
+        <w:t>4. Implement coordinator record validation and idempotent handoff controls only after the process fields and interface are agreed. Existing IAM, funding and durable-state boundaries remain enforced. Do not duplicate SBA tasks or silently change statuses.</w:t>
+      </w:r>
+    </w:p>
+    <w:p>
+      <w:r>
+        <w:t>5. Qualify automation against missing/stale briefs, mismatched candidates, incomplete evidence, revoked authority, disputed findings, repeated failures, crashes and duplicate events. Uncertain work pauses; no blind replay or extra funding.</w:t>
+      </w:r>
+    </w:p>
+    <w:p>
+      <w:r>
+        <w:t>6. Decide whether to retain, revise or stop an intervention based on the pilot. No production activation is authorized by this case study.</w:t>
       </w:r>
     </w:p>
     <w:p>
@@ -576,42 +988,285 @@
         <w:pStyle w:val="Heading1"/>
       </w:pPr>
       <w:r>
-        <w:t>8. Source register</w:t>
+        <w:t>10. Pilot measurement and safeguards</w:t>
+      </w:r>
+    </w:p>
+    <w:tbl>
+      <w:tblPr>
+        <w:tblStyle w:val="LightShading-Accent1"/>
+        <w:tblW w:type="auto" w:w="0"/>
+        <w:tblLook w:firstColumn="1" w:firstRow="1" w:lastColumn="0" w:lastRow="0" w:noHBand="0" w:noVBand="1" w:val="04A0"/>
+      </w:tblPr>
+      <w:tblGrid>
+        <w:gridCol w:w="2880"/>
+        <w:gridCol w:w="2880"/>
+        <w:gridCol w:w="2880"/>
+      </w:tblGrid>
+      <w:tr>
+        <w:tc>
+          <w:tcPr>
+            <w:tcW w:type="dxa" w:w="2880"/>
+          </w:tcPr>
+          <w:p>
+            <w:r>
+              <w:t>Measure</w:t>
+            </w:r>
+          </w:p>
+        </w:tc>
+        <w:tc>
+          <w:tcPr>
+            <w:tcW w:type="dxa" w:w="2880"/>
+          </w:tcPr>
+          <w:p>
+            <w:r>
+              <w:t>Definition</w:t>
+            </w:r>
+          </w:p>
+        </w:tc>
+        <w:tc>
+          <w:tcPr>
+            <w:tcW w:type="dxa" w:w="2880"/>
+          </w:tcPr>
+          <w:p>
+            <w:r>
+              <w:t>Interpretation</w:t>
+            </w:r>
+          </w:p>
+        </w:tc>
+      </w:tr>
+      <w:tr>
+        <w:tc>
+          <w:tcPr>
+            <w:tcW w:type="dxa" w:w="2880"/>
+          </w:tcPr>
+          <w:p>
+            <w:r>
+              <w:t>First-pass acceptance</w:t>
+            </w:r>
+          </w:p>
+        </w:tc>
+        <w:tc>
+          <w:tcPr>
+            <w:tcW w:type="dxa" w:w="2880"/>
+          </w:tcPr>
+          <w:p>
+            <w:r>
+              <w:t>First submissions accepted within explicit scope / adjudicated first submissions</w:t>
+            </w:r>
+          </w:p>
+        </w:tc>
+        <w:tc>
+          <w:tcPr>
+            <w:tcW w:type="dxa" w:w="2880"/>
+          </w:tcPr>
+          <w:p>
+            <w:r>
+              <w:t>Separate full and conditional decisions; report pending denominator</w:t>
+            </w:r>
+          </w:p>
+        </w:tc>
+      </w:tr>
+      <w:tr>
+        <w:tc>
+          <w:tcPr>
+            <w:tcW w:type="dxa" w:w="2880"/>
+          </w:tcPr>
+          <w:p>
+            <w:r>
+              <w:t>Follow-up proportion</w:t>
+            </w:r>
+          </w:p>
+        </w:tc>
+        <w:tc>
+          <w:tcPr>
+            <w:tcW w:type="dxa" w:w="2880"/>
+          </w:tcPr>
+          <w:p>
+            <w:r>
+              <w:t>Follow-up formal rounds / total formal rounds</w:t>
+            </w:r>
+          </w:p>
+        </w:tc>
+        <w:tc>
+          <w:tcPr>
+            <w:tcW w:type="dxa" w:w="2880"/>
+          </w:tcPr>
+          <w:p>
+            <w:r>
+              <w:t>Not hours or code error</w:t>
+            </w:r>
+          </w:p>
+        </w:tc>
+      </w:tr>
+      <w:tr>
+        <w:tc>
+          <w:tcPr>
+            <w:tcW w:type="dxa" w:w="2880"/>
+          </w:tcPr>
+          <w:p>
+            <w:r>
+              <w:t>Total repeat episodes</w:t>
+            </w:r>
+          </w:p>
+        </w:tc>
+        <w:tc>
+          <w:tcPr>
+            <w:tcW w:type="dxa" w:w="2880"/>
+          </w:tcPr>
+          <w:p>
+            <w:r>
+              <w:t>Readiness returns, correction rounds and design revisions, with episode IDs</w:t>
+            </w:r>
+          </w:p>
+        </w:tc>
+        <w:tc>
+          <w:tcPr>
+            <w:tcW w:type="dxa" w:w="2880"/>
+          </w:tcPr>
+          <w:p>
+            <w:r>
+              <w:t>Avoid counting the same episode twice across categories</w:t>
+            </w:r>
+          </w:p>
+        </w:tc>
+      </w:tr>
+      <w:tr>
+        <w:tc>
+          <w:tcPr>
+            <w:tcW w:type="dxa" w:w="2880"/>
+          </w:tcPr>
+          <w:p>
+            <w:r>
+              <w:t>Recurrence</w:t>
+            </w:r>
+          </w:p>
+        </w:tc>
+        <w:tc>
+          <w:tcPr>
+            <w:tcW w:type="dxa" w:w="2880"/>
+          </w:tcPr>
+          <w:p>
+            <w:r>
+              <w:t>Previously claimed-closed rule observed again</w:t>
+            </w:r>
+          </w:p>
+        </w:tc>
+        <w:tc>
+          <w:tcPr>
+            <w:tcW w:type="dxa" w:w="2880"/>
+          </w:tcPr>
+          <w:p>
+            <w:r>
+              <w:t>Distinguish new scope and new manifestations</w:t>
+            </w:r>
+          </w:p>
+        </w:tc>
+      </w:tr>
+      <w:tr>
+        <w:tc>
+          <w:tcPr>
+            <w:tcW w:type="dxa" w:w="2880"/>
+          </w:tcPr>
+          <w:p>
+            <w:r>
+              <w:t>Rounds to acceptance</w:t>
+            </w:r>
+          </w:p>
+        </w:tc>
+        <w:tc>
+          <w:tcPr>
+            <w:tcW w:type="dxa" w:w="2880"/>
+          </w:tcPr>
+          <w:p>
+            <w:r>
+              <w:t>Total recorded rounds through scoped acceptance per completed package</w:t>
+            </w:r>
+          </w:p>
+        </w:tc>
+        <w:tc>
+          <w:tcPr>
+            <w:tcW w:type="dxa" w:w="2880"/>
+          </w:tcPr>
+          <w:p>
+            <w:r>
+              <w:t>Report pending and cross-builder work separately</w:t>
+            </w:r>
+          </w:p>
+        </w:tc>
+      </w:tr>
+      <w:tr>
+        <w:tc>
+          <w:tcPr>
+            <w:tcW w:type="dxa" w:w="2880"/>
+          </w:tcPr>
+          <w:p>
+            <w:r>
+              <w:t>Owner intervention</w:t>
+            </w:r>
+          </w:p>
+        </w:tc>
+        <w:tc>
+          <w:tcPr>
+            <w:tcW w:type="dxa" w:w="2880"/>
+          </w:tcPr>
+          <w:p>
+            <w:r>
+              <w:t>Routine relay/coordination actions per package</w:t>
+            </w:r>
+          </w:p>
+        </w:tc>
+        <w:tc>
+          <w:tcPr>
+            <w:tcW w:type="dxa" w:w="2880"/>
+          </w:tcPr>
+          <w:p>
+            <w:r>
+              <w:t>Exclude intended business/release decisions, record other human involvement</w:t>
+            </w:r>
+          </w:p>
+        </w:tc>
+      </w:tr>
+      <w:tr>
+        <w:tc>
+          <w:tcPr>
+            <w:tcW w:type="dxa" w:w="2880"/>
+          </w:tcPr>
+          <w:p>
+            <w:r>
+              <w:t>Quality safeguard</w:t>
+            </w:r>
+          </w:p>
+        </w:tc>
+        <w:tc>
+          <w:tcPr>
+            <w:tcW w:type="dxa" w:w="2880"/>
+          </w:tcPr>
+          <w:p>
+            <w:r>
+              <w:t>Confirmed post-acceptance requirement violations</w:t>
+            </w:r>
+          </w:p>
+        </w:tc>
+        <w:tc>
+          <w:tcPr>
+            <w:tcW w:type="dxa" w:w="2880"/>
+          </w:tcPr>
+          <w:p>
+            <w:r>
+              <w:t>Use a consistent 14-day observation window, not zero incidents as proof of zero risk</w:t>
+            </w:r>
+          </w:p>
+        </w:tc>
+      </w:tr>
+    </w:tbl>
+    <w:p>
+      <w:r>
+        <w:t>A 50% reduction in follow-up rounds is an exploratory target, not a result or forecast. The historical 14 follow-ups gives illustrative scenarios of 10, 7 or 4 follow-ups (29%, 50%, 71% reductions), but incomplete historical endpoints prevent direct efficacy claims. Establish a comparable prospective baseline. Hours remain excluded. Count stronger upfront checking as work rather than pretend it is free.</w:t>
       </w:r>
     </w:p>
     <w:p>
       <w:r>
-        <w:t>projects/scrum-board-automation/planning/AGENT_DELIVERY_RELIABILITY_AUDIT.md</w:t>
-      </w:r>
-    </w:p>
-    <w:p>
-      <w:r>
-        <w:t>projects/scrum-board-automation/planning/AGENT_DELIVERY_AUDIT_LEDGER.json</w:t>
-      </w:r>
-    </w:p>
-    <w:p>
-      <w:r>
-        <w:t>projects/scrum-board-automation/planning/REWORK_CAUSE_ANALYSIS.md</w:t>
-      </w:r>
-    </w:p>
-    <w:p>
-      <w:r>
-        <w:t>projects/scrum-board-automation/planning/REWORK_CAUSE_LEDGER.json</w:t>
-      </w:r>
-    </w:p>
-    <w:p>
-      <w:r>
-        <w:t>Private corpus: /workspace/research/acinonyx-delivery-2026-10-13/README.md</w:t>
-      </w:r>
-    </w:p>
-    <w:p>
-      <w:r>
-        <w:t>This document defines the research problem and preliminary evidence. It is not a completed causal study or a release acceptance decision.</w:t>
-      </w:r>
-    </w:p>
-    <w:p>
-      <w:r>
-        <w:br w:type="page"/>
+        <w:t>Retain an intervention if comparable packages show lower recurrence and routine owner intervention without weaker evidence or increased confirmed post-acceptance violations. If the sample is mixed, small or still pending, extend measurement rather than claim success. Revise added ceremony if it merely shifts repeated work upstream. Publish every failure and unresolved case.</w:t>
       </w:r>
     </w:p>
     <w:p>
@@ -619,12 +1274,48 @@
         <w:pStyle w:val="Heading1"/>
       </w:pPr>
       <w:r>
-        <w:t>9. Detailed evidence supporting the diagnostic findings</w:t>
+        <w:t>11. Limitations and alternative explanations</w:t>
       </w:r>
     </w:p>
     <w:p>
       <w:r>
-        <w:t>Evidence expansion: 13 October 2026. The following observations are reproduced from candidate-specific review records. They were not rerun for this document update. Exact excerpts are quoted separately from our interpretation. Historical defects may have been corrected since the reviewed candidate; their inclusion does not assert that they remain present today.</w:t>
+        <w:t>This is a single-project retrospective with a purposive sample and author involvement in review. Reviewer selection and confirmation bias are possible. Git author metadata cannot reliably identify the agent. Uncommitted/deleted/remote session material, provider spending and hours are incomplete. Original requirement attribution is unresolved for some findings. Environment and task complexity differ. Recurring families overlap. A code defect, a reporting error and a new requirement are not interchangeable.</w:t>
+      </w:r>
+    </w:p>
+    <w:p>
+      <w:r>
+        <w:t>The case study demonstrates recorded failures and supports specific mechanisms; it does not establish provider rankings, exact causal contribution percentages or proven reduction from the proposed intervention. A separate reviewer should challenge the study and pilot classifications before commercial or scientific claims.</w:t>
+      </w:r>
+    </w:p>
+    <w:p>
+      <w:pPr>
+        <w:pStyle w:val="Heading1"/>
+      </w:pPr>
+      <w:r>
+        <w:t>12. Conclusion and applicability</w:t>
+      </w:r>
+    </w:p>
+    <w:p>
+      <w:r>
+        <w:t>The observed rework is not primarily resolved by asking the owner to write better prompts. Technical translation, enforcement-design selection, failure testing and closure discipline belong to the delivery process. The practical remedy is to make acceptance shared and explicit before work, preserve independent judgment at the end, and stop repeated symptom patching when an invariant remains open.</w:t>
+      </w:r>
+    </w:p>
+    <w:p>
+      <w:r>
+        <w:t>The retrospective case study is complete for its declared scope. Its solution is ready for a controlled application trial; effectiveness and automated enforcement remain pending. Success means fewer avoidable repeats and less owner coordination with trustworthy accepted results, not simply a lower rejection count.</w:t>
+      </w:r>
+    </w:p>
+    <w:p>
+      <w:pPr>
+        <w:pStyle w:val="Heading1"/>
+      </w:pPr>
+      <w:r>
+        <w:t>Appendix A. Evidence and source register</w:t>
+      </w:r>
+    </w:p>
+    <w:p>
+      <w:r>
+        <w:t>Exact excerpts, original review lines and candidate identities follow. These are historical recorded reproductions, not newly executed tests. They must not be presented as unresolved defects in the current revision without checking current code.</w:t>
       </w:r>
     </w:p>
     <w:p>
@@ -637,12 +1328,7 @@
     </w:p>
     <w:p>
       <w:r>
-        <w:t>Reviewed code candidate: 7bcdd079e484539545bc5661b6654ac6b0489b7e</w:t>
-      </w:r>
-    </w:p>
-    <w:p>
-      <w:r>
-        <w:t>Recorded observation — exact source excerpt:</w:t>
+        <w:t>Reviewed candidate: `7bcdd079e484539545bc5661b6654ac6b0489b7e`.</w:t>
       </w:r>
     </w:p>
     <w:p>
@@ -659,14 +1345,13 @@
       </w:r>
     </w:p>
     <w:p>
+      <w:r/>
       <w:hyperlink r:id="rId9">
         <w:r>
-          <w:rPr>
-            <w:color w:val="0563C1"/>
-          </w:rPr>
-          <w:t>Open original review, line 19</w:t>
+          <w:t>Original review, line 19</w:t>
         </w:r>
       </w:hyperlink>
+      <w:r/>
     </w:p>
     <w:p>
       <w:pPr>
@@ -678,12 +1363,7 @@
     </w:p>
     <w:p>
       <w:r>
-        <w:t>Reviewed code candidate: 148ad03403887c8a63471553ecc192060ba072e1</w:t>
-      </w:r>
-    </w:p>
-    <w:p>
-      <w:r>
-        <w:t>Recorded observation — exact source excerpt:</w:t>
+        <w:t>Reviewed candidate: `148ad03403887c8a63471553ecc192060ba072e1`.</w:t>
       </w:r>
     </w:p>
     <w:p>
@@ -700,14 +1380,13 @@
       </w:r>
     </w:p>
     <w:p>
+      <w:r/>
       <w:hyperlink r:id="rId10">
         <w:r>
-          <w:rPr>
-            <w:color w:val="0563C1"/>
-          </w:rPr>
-          <w:t>Open original review, line 15</w:t>
+          <w:t>Original review, line 15</w:t>
         </w:r>
       </w:hyperlink>
+      <w:r/>
     </w:p>
     <w:p>
       <w:pPr>
@@ -719,12 +1398,7 @@
     </w:p>
     <w:p>
       <w:r>
-        <w:t>Reviewed code candidate: d19b0924a67edbd0e82d54f385e01031a89a5a43</w:t>
-      </w:r>
-    </w:p>
-    <w:p>
-      <w:r>
-        <w:t>Recorded observation — exact source excerpt:</w:t>
+        <w:t>Reviewed candidate: `d19b0924a67edbd0e82d54f385e01031a89a5a43`.</w:t>
       </w:r>
     </w:p>
     <w:p>
@@ -741,14 +1415,13 @@
       </w:r>
     </w:p>
     <w:p>
+      <w:r/>
       <w:hyperlink r:id="rId11">
         <w:r>
-          <w:rPr>
-            <w:color w:val="0563C1"/>
-          </w:rPr>
-          <w:t>Open original review, line 19</w:t>
+          <w:t>Original review, line 19</w:t>
         </w:r>
       </w:hyperlink>
+      <w:r/>
     </w:p>
     <w:p>
       <w:pPr>
@@ -760,12 +1433,7 @@
     </w:p>
     <w:p>
       <w:r>
-        <w:t>Reviewed code candidate: fc4886cd99ec2c5ad05615026bdd1807cac2f883</w:t>
-      </w:r>
-    </w:p>
-    <w:p>
-      <w:r>
-        <w:t>Recorded observation — exact source excerpt:</w:t>
+        <w:t>Reviewed candidate: `fc4886cd99ec2c5ad05615026bdd1807cac2f883`.</w:t>
       </w:r>
     </w:p>
     <w:p>
@@ -782,14 +1450,13 @@
       </w:r>
     </w:p>
     <w:p>
+      <w:r/>
       <w:hyperlink r:id="rId12">
         <w:r>
-          <w:rPr>
-            <w:color w:val="0563C1"/>
-          </w:rPr>
-          <w:t>Open original review, line 15</w:t>
+          <w:t>Original review, line 15</w:t>
         </w:r>
       </w:hyperlink>
+      <w:r/>
     </w:p>
     <w:p>
       <w:pPr>
@@ -801,12 +1468,7 @@
     </w:p>
     <w:p>
       <w:r>
-        <w:t>Reviewed code candidate: fc4886cd99ec2c5ad05615026bdd1807cac2f883</w:t>
-      </w:r>
-    </w:p>
-    <w:p>
-      <w:r>
-        <w:t>Recorded observation — exact source excerpt:</w:t>
+        <w:t>Reviewed candidate: `fc4886cd99ec2c5ad05615026bdd1807cac2f883`.</w:t>
       </w:r>
     </w:p>
     <w:p>
@@ -823,14 +1485,13 @@
       </w:r>
     </w:p>
     <w:p>
+      <w:r/>
       <w:hyperlink r:id="rId13">
         <w:r>
-          <w:rPr>
-            <w:color w:val="0563C1"/>
-          </w:rPr>
-          <w:t>Open original review, line 17</w:t>
+          <w:t>Original review, line 17</w:t>
         </w:r>
       </w:hyperlink>
+      <w:r/>
     </w:p>
     <w:p>
       <w:pPr>
@@ -842,12 +1503,7 @@
     </w:p>
     <w:p>
       <w:r>
-        <w:t>Reviewed code candidate: fc4886cd99ec2c5ad05615026bdd1807cac2f883</w:t>
-      </w:r>
-    </w:p>
-    <w:p>
-      <w:r>
-        <w:t>Recorded observation — exact source excerpt:</w:t>
+        <w:t>Reviewed candidate: `fc4886cd99ec2c5ad05615026bdd1807cac2f883`.</w:t>
       </w:r>
     </w:p>
     <w:p>
@@ -864,14 +1520,13 @@
       </w:r>
     </w:p>
     <w:p>
+      <w:r/>
       <w:hyperlink r:id="rId14">
         <w:r>
-          <w:rPr>
-            <w:color w:val="0563C1"/>
-          </w:rPr>
-          <w:t>Open original review, line 19</w:t>
+          <w:t>Original review, line 19</w:t>
         </w:r>
       </w:hyperlink>
+      <w:r/>
     </w:p>
     <w:p>
       <w:pPr>
@@ -883,12 +1538,7 @@
     </w:p>
     <w:p>
       <w:r>
-        <w:t>Reviewed code candidate: f6d2f34a7f7c72872d10769177ae06f1fe2315a2</w:t>
-      </w:r>
-    </w:p>
-    <w:p>
-      <w:r>
-        <w:t>Recorded observation — exact source excerpt:</w:t>
+        <w:t>Reviewed candidate: `f6d2f34a7f7c72872d10769177ae06f1fe2315a2`.</w:t>
       </w:r>
     </w:p>
     <w:p>
@@ -905,14 +1555,13 @@
       </w:r>
     </w:p>
     <w:p>
+      <w:r/>
       <w:hyperlink r:id="rId15">
         <w:r>
-          <w:rPr>
-            <w:color w:val="0563C1"/>
-          </w:rPr>
-          <w:t>Open original review, line 13</w:t>
+          <w:t>Original review, line 13</w:t>
         </w:r>
       </w:hyperlink>
+      <w:r/>
     </w:p>
     <w:p>
       <w:pPr>
@@ -924,12 +1573,7 @@
     </w:p>
     <w:p>
       <w:r>
-        <w:t>Reviewed code candidate: 07294b0fb74d4073b9cd2315cc0f60f35fc9ab38</w:t>
-      </w:r>
-    </w:p>
-    <w:p>
-      <w:r>
-        <w:t>Recorded observation — exact source excerpt:</w:t>
+        <w:t>Reviewed candidate: `07294b0fb74d4073b9cd2315cc0f60f35fc9ab38`.</w:t>
       </w:r>
     </w:p>
     <w:p>
@@ -946,14 +1590,13 @@
       </w:r>
     </w:p>
     <w:p>
+      <w:r/>
       <w:hyperlink r:id="rId16">
         <w:r>
-          <w:rPr>
-            <w:color w:val="0563C1"/>
-          </w:rPr>
-          <w:t>Open original review, line 13</w:t>
+          <w:t>Original review, line 13</w:t>
         </w:r>
       </w:hyperlink>
+      <w:r/>
     </w:p>
     <w:p>
       <w:pPr>
@@ -965,12 +1608,7 @@
     </w:p>
     <w:p>
       <w:r>
-        <w:t>Reviewed code candidate: b4db4a7d1dd3d65273810899341ff0cb2b5178d7</w:t>
-      </w:r>
-    </w:p>
-    <w:p>
-      <w:r>
-        <w:t>Recorded observation — exact source excerpt:</w:t>
+        <w:t>Reviewed candidate: `b4db4a7d1dd3d65273810899341ff0cb2b5178d7`.</w:t>
       </w:r>
     </w:p>
     <w:p>
@@ -987,14 +1625,13 @@
       </w:r>
     </w:p>
     <w:p>
+      <w:r/>
       <w:hyperlink r:id="rId17">
         <w:r>
-          <w:rPr>
-            <w:color w:val="0563C1"/>
-          </w:rPr>
-          <w:t>Open original review, line 14</w:t>
+          <w:t>Original review, line 14</w:t>
         </w:r>
       </w:hyperlink>
+      <w:r/>
     </w:p>
     <w:p>
       <w:pPr>
@@ -1006,12 +1643,7 @@
     </w:p>
     <w:p>
       <w:r>
-        <w:t>Reviewed code candidate: f6d2f34a7f7c72872d10769177ae06f1fe2315a2</w:t>
-      </w:r>
-    </w:p>
-    <w:p>
-      <w:r>
-        <w:t>Recorded observation — exact source excerpt:</w:t>
+        <w:t>Reviewed candidate: `f6d2f34a7f7c72872d10769177ae06f1fe2315a2`.</w:t>
       </w:r>
     </w:p>
     <w:p>
@@ -1028,61 +1660,241 @@
       </w:r>
     </w:p>
     <w:p>
+      <w:r/>
       <w:hyperlink r:id="rId18">
         <w:r>
-          <w:rPr>
-            <w:color w:val="0563C1"/>
-          </w:rPr>
-          <w:t>Open original review, line 15</w:t>
+          <w:t>Original review, line 15</w:t>
         </w:r>
       </w:hyperlink>
+      <w:r/>
     </w:p>
     <w:p>
       <w:pPr>
         <w:pStyle w:val="Heading1"/>
       </w:pPr>
       <w:r>
-        <w:t>10. Evidence of changing specifications and reporting errors</w:t>
+        <w:t>Appendix B. All seventeen counted rejection records</w:t>
       </w:r>
     </w:p>
     <w:p>
       <w:r>
-        <w:t>The reviews also refined proposal versioning, strict HTTP types, adapter qualification and controlled-only acceptance. These changes cannot all be attributed to the implementer without comparing each requirement with its original version. The evidence supports repeated failures after explicit directives; it does not establish that every initial omission violated an already-agreed detailed requirement.</w:t>
+        <w:t xml:space="preserve">1. SBA-02/SBA-05, round 1: </w:t>
+      </w:r>
+      <w:hyperlink r:id="rId19">
+        <w:r>
+          <w:t>SBA_02_05_BACKEND_REVIEW.md</w:t>
+        </w:r>
+      </w:hyperlink>
+      <w:r>
+        <w:t>. Antigravity implementation; Codex review. Other design/discovery verdicts in combined reviews are separate.</w:t>
       </w:r>
     </w:p>
     <w:p>
       <w:r>
-        <w:t>Exact correction of the review evidence:</w:t>
+        <w:t xml:space="preserve">2. SBA-02/SBA-05, round 2: </w:t>
+      </w:r>
+      <w:hyperlink r:id="rId20">
+        <w:r>
+          <w:t>SBA_02_05_REWORK_REVIEW.md</w:t>
+        </w:r>
+      </w:hyperlink>
+      <w:r>
+        <w:t>. Antigravity implementation; Codex review. Other design/discovery verdicts in combined reviews are separate.</w:t>
       </w:r>
     </w:p>
     <w:p>
-      <w:pPr>
-        <w:pStyle w:val="Quote"/>
-      </w:pPr>
       <w:r>
-        <w:t>`51a08a12` contained three errors:</w:t>
-        <w:br/>
-        <w:br/>
-        <w:t>1. It reported per-file counts of 4 / 30 / 27. These were wrong. The real runner counts are below.</w:t>
-        <w:br/>
-        <w:t>2. It cited a full gate that had been launched but whose result had not been read.</w:t>
-        <w:br/>
-        <w:t>3. It claimed container behaviour had been reproduced independently. That claim is withdrawn: no container check could run in this environment.</w:t>
+        <w:t xml:space="preserve">3. SBA-03, round 1: </w:t>
+      </w:r>
+      <w:hyperlink r:id="rId21">
+        <w:r>
+          <w:t>SBA_03_REVIEW.md</w:t>
+        </w:r>
+      </w:hyperlink>
+      <w:r>
+        <w:t>. Antigravity implementation; Codex review. Other design/discovery verdicts in combined reviews are separate.</w:t>
       </w:r>
     </w:p>
     <w:p>
-      <w:hyperlink r:id="rId19">
+      <w:r>
+        <w:t xml:space="preserve">4. SBA-03, round 2: </w:t>
+      </w:r>
+      <w:hyperlink r:id="rId22">
         <w:r>
-          <w:rPr>
-            <w:color w:val="0563C1"/>
-          </w:rPr>
-          <w:t>Open revised independent review</w:t>
+          <w:t>CC_01_SBA_03_RESUBMISSION_REVIEW.md</w:t>
         </w:r>
       </w:hyperlink>
+      <w:r>
+        <w:t>. Antigravity implementation; Codex review. Other design/discovery verdicts in combined reviews are separate.</w:t>
+      </w:r>
     </w:p>
     <w:p>
       <w:r>
-        <w:t>Interpretation: missing Docker is an infrastructure limitation. Claiming unavailable checks were reproduced is a review/reporting error. This example concerns Antigravity reviewing Codex-authored code, demonstrating that the research must include reviewer mistakes as well as implementation defects.</w:t>
+        <w:t xml:space="preserve">5. SBA-03, round 3: </w:t>
+      </w:r>
+      <w:hyperlink r:id="rId23">
+        <w:r>
+          <w:t>CC_02_SBA_03_REVIEW.md</w:t>
+        </w:r>
+      </w:hyperlink>
+      <w:r>
+        <w:t>. Antigravity implementation; Codex review. Other design/discovery verdicts in combined reviews are separate.</w:t>
+      </w:r>
+    </w:p>
+    <w:p>
+      <w:r>
+        <w:t xml:space="preserve">6. SBA-03, round 4: </w:t>
+      </w:r>
+      <w:hyperlink r:id="rId24">
+        <w:r>
+          <w:t>CC_02_REVIEW_3.md</w:t>
+        </w:r>
+      </w:hyperlink>
+      <w:r>
+        <w:t>. Antigravity implementation; Codex review. Other design/discovery verdicts in combined reviews are separate.</w:t>
+      </w:r>
+    </w:p>
+    <w:p>
+      <w:r>
+        <w:t xml:space="preserve">7. SBA-03, round 5: </w:t>
+      </w:r>
+      <w:hyperlink r:id="rId25">
+        <w:r>
+          <w:t>CC_02_REVIEW_4.md</w:t>
+        </w:r>
+      </w:hyperlink>
+      <w:r>
+        <w:t>. Antigravity implementation; Codex review. Other design/discovery verdicts in combined reviews are separate.</w:t>
+      </w:r>
+    </w:p>
+    <w:p>
+      <w:r>
+        <w:t xml:space="preserve">8. CC-03, round 1: </w:t>
+      </w:r>
+      <w:hyperlink r:id="rId26">
+        <w:r>
+          <w:t>CC_03_INDEPENDENT_REVIEW.md</w:t>
+        </w:r>
+      </w:hyperlink>
+      <w:r>
+        <w:t>. Antigravity implementation; Codex review. Other design/discovery verdicts in combined reviews are separate.</w:t>
+      </w:r>
+    </w:p>
+    <w:p>
+      <w:r>
+        <w:t xml:space="preserve">9. CC-03, round 2: </w:t>
+      </w:r>
+      <w:hyperlink r:id="rId27">
+        <w:r>
+          <w:t>CC_03_REWORK_REVIEW.md</w:t>
+        </w:r>
+      </w:hyperlink>
+      <w:r>
+        <w:t>. Antigravity implementation; Codex review. Other design/discovery verdicts in combined reviews are separate.</w:t>
+      </w:r>
+    </w:p>
+    <w:p>
+      <w:r>
+        <w:t xml:space="preserve">10. CC-03, round 3: </w:t>
+      </w:r>
+      <w:hyperlink r:id="rId28">
+        <w:r>
+          <w:t>CC_03_REVIEW_3.md</w:t>
+        </w:r>
+      </w:hyperlink>
+      <w:r>
+        <w:t>. Antigravity implementation; Codex review. Other design/discovery verdicts in combined reviews are separate.</w:t>
+      </w:r>
+    </w:p>
+    <w:p>
+      <w:r>
+        <w:t xml:space="preserve">11. CC-04, round 1: </w:t>
+      </w:r>
+      <w:hyperlink r:id="rId29">
+        <w:r>
+          <w:t>CC_04_INDEPENDENT_REVIEW.md</w:t>
+        </w:r>
+      </w:hyperlink>
+      <w:r>
+        <w:t>. Antigravity implementation; Codex review. Other design/discovery verdicts in combined reviews are separate.</w:t>
+      </w:r>
+    </w:p>
+    <w:p>
+      <w:r>
+        <w:t xml:space="preserve">12. CC-04, round 2: </w:t>
+      </w:r>
+      <w:hyperlink r:id="rId30">
+        <w:r>
+          <w:t>CC_04_REWORK_REVIEW.md</w:t>
+        </w:r>
+      </w:hyperlink>
+      <w:r>
+        <w:t>. Antigravity implementation; Codex review. Other design/discovery verdicts in combined reviews are separate.</w:t>
+      </w:r>
+    </w:p>
+    <w:p>
+      <w:r>
+        <w:t xml:space="preserve">13. CC-04, round 3: </w:t>
+      </w:r>
+      <w:hyperlink r:id="rId31">
+        <w:r>
+          <w:t>CC_04_REVIEW_3.md</w:t>
+        </w:r>
+      </w:hyperlink>
+      <w:r>
+        <w:t>. Antigravity implementation; Codex review. Other design/discovery verdicts in combined reviews are separate.</w:t>
+      </w:r>
+    </w:p>
+    <w:p>
+      <w:r>
+        <w:t xml:space="preserve">14. CC-04, round 4: </w:t>
+      </w:r>
+      <w:hyperlink r:id="rId32">
+        <w:r>
+          <w:t>CC_04_REVIEW_4.md</w:t>
+        </w:r>
+      </w:hyperlink>
+      <w:r>
+        <w:t>. Antigravity implementation; Codex review. Other design/discovery verdicts in combined reviews are separate.</w:t>
+      </w:r>
+    </w:p>
+    <w:p>
+      <w:r>
+        <w:t xml:space="preserve">15. CC-04, round 5: </w:t>
+      </w:r>
+      <w:hyperlink r:id="rId33">
+        <w:r>
+          <w:t>CC_04_REVIEW_5.md</w:t>
+        </w:r>
+      </w:hyperlink>
+      <w:r>
+        <w:t>. Antigravity implementation; Codex review. Other design/discovery verdicts in combined reviews are separate.</w:t>
+      </w:r>
+    </w:p>
+    <w:p>
+      <w:r>
+        <w:t xml:space="preserve">16. CC-05/CC-06, round 1: </w:t>
+      </w:r>
+      <w:hyperlink r:id="rId34">
+        <w:r>
+          <w:t>CC_05_06_INDEPENDENT_REVIEW.md</w:t>
+        </w:r>
+      </w:hyperlink>
+      <w:r>
+        <w:t>. Antigravity implementation; Codex review. Other design/discovery verdicts in combined reviews are separate.</w:t>
+      </w:r>
+    </w:p>
+    <w:p>
+      <w:r>
+        <w:t xml:space="preserve">17. CC-05/CC-06, round 2: </w:t>
+      </w:r>
+      <w:hyperlink r:id="rId35">
+        <w:r>
+          <w:t>CC_05_06_REWORK_REVIEW.md</w:t>
+        </w:r>
+      </w:hyperlink>
+      <w:r>
+        <w:t>. Antigravity implementation; Codex review. Other design/discovery verdicts in combined reviews are separate.</w:t>
       </w:r>
     </w:p>
     <w:p>
@@ -1090,913 +1902,68 @@
         <w:pStyle w:val="Heading1"/>
       </w:pPr>
       <w:r>
-        <w:t>11. Complete counted rejection register</w:t>
-      </w:r>
-    </w:p>
-    <w:p>
-      <w:pPr>
-        <w:pStyle w:val="Heading2"/>
-      </w:pPr>
-      <w:r>
-        <w:t>R01 — SBA-02/SBA-05, submission round 1</w:t>
-      </w:r>
-    </w:p>
-    <w:p>
-      <w:r>
-        <w:t>Builder: Antigravity. Reviewer: Codex. Recorded result: rejected for the specified implementation package. Other discovery/design verdicts in the same review are separate.</w:t>
-      </w:r>
-    </w:p>
-    <w:p>
-      <w:hyperlink r:id="rId20">
-        <w:r>
-          <w:rPr>
-            <w:color w:val="0563C1"/>
-          </w:rPr>
-          <w:t>SBA_02_05_BACKEND_REVIEW.md</w:t>
-        </w:r>
-      </w:hyperlink>
-    </w:p>
-    <w:p>
-      <w:pPr>
-        <w:pStyle w:val="Heading2"/>
-      </w:pPr>
-      <w:r>
-        <w:t>R02 — SBA-02/SBA-05, submission round 2</w:t>
-      </w:r>
-    </w:p>
-    <w:p>
-      <w:r>
-        <w:t>Builder: Antigravity. Reviewer: Codex. Recorded result: rejected for the specified implementation package. Other discovery/design verdicts in the same review are separate.</w:t>
-      </w:r>
-    </w:p>
-    <w:p>
-      <w:hyperlink r:id="rId21">
-        <w:r>
-          <w:rPr>
-            <w:color w:val="0563C1"/>
-          </w:rPr>
-          <w:t>SBA_02_05_REWORK_REVIEW.md</w:t>
-        </w:r>
-      </w:hyperlink>
-    </w:p>
-    <w:p>
-      <w:pPr>
-        <w:pStyle w:val="Heading2"/>
-      </w:pPr>
-      <w:r>
-        <w:t>R03 — SBA-03, submission round 1</w:t>
-      </w:r>
-    </w:p>
-    <w:p>
-      <w:r>
-        <w:t>Builder: Antigravity. Reviewer: Codex. Recorded result: rejected for the specified implementation package. Other discovery/design verdicts in the same review are separate.</w:t>
-      </w:r>
-    </w:p>
-    <w:p>
-      <w:hyperlink r:id="rId22">
-        <w:r>
-          <w:rPr>
-            <w:color w:val="0563C1"/>
-          </w:rPr>
-          <w:t>SBA_03_REVIEW.md</w:t>
-        </w:r>
-      </w:hyperlink>
-    </w:p>
-    <w:p>
-      <w:pPr>
-        <w:pStyle w:val="Heading2"/>
-      </w:pPr>
-      <w:r>
-        <w:t>R04 — SBA-03, submission round 2</w:t>
-      </w:r>
-    </w:p>
-    <w:p>
-      <w:r>
-        <w:t>Builder: Antigravity. Reviewer: Codex. Recorded result: rejected for the specified implementation package. Other discovery/design verdicts in the same review are separate.</w:t>
-      </w:r>
-    </w:p>
-    <w:p>
-      <w:hyperlink r:id="rId23">
-        <w:r>
-          <w:rPr>
-            <w:color w:val="0563C1"/>
-          </w:rPr>
-          <w:t>CC_01_SBA_03_RESUBMISSION_REVIEW.md</w:t>
-        </w:r>
-      </w:hyperlink>
-    </w:p>
-    <w:p>
-      <w:pPr>
-        <w:pStyle w:val="Heading2"/>
-      </w:pPr>
-      <w:r>
-        <w:t>R05 — SBA-03, submission round 3</w:t>
-      </w:r>
-    </w:p>
-    <w:p>
-      <w:r>
-        <w:t>Builder: Antigravity. Reviewer: Codex. Recorded result: rejected for the specified implementation package. Other discovery/design verdicts in the same review are separate.</w:t>
-      </w:r>
-    </w:p>
-    <w:p>
-      <w:hyperlink r:id="rId24">
-        <w:r>
-          <w:rPr>
-            <w:color w:val="0563C1"/>
-          </w:rPr>
-          <w:t>CC_02_SBA_03_REVIEW.md</w:t>
-        </w:r>
-      </w:hyperlink>
-    </w:p>
-    <w:p>
-      <w:pPr>
-        <w:pStyle w:val="Heading2"/>
-      </w:pPr>
-      <w:r>
-        <w:t>R06 — SBA-03, submission round 4</w:t>
-      </w:r>
-    </w:p>
-    <w:p>
-      <w:r>
-        <w:t>Builder: Antigravity. Reviewer: Codex. Recorded result: rejected for the specified implementation package. Other discovery/design verdicts in the same review are separate.</w:t>
-      </w:r>
-    </w:p>
-    <w:p>
-      <w:hyperlink r:id="rId25">
-        <w:r>
-          <w:rPr>
-            <w:color w:val="0563C1"/>
-          </w:rPr>
-          <w:t>CC_02_REVIEW_3.md</w:t>
-        </w:r>
-      </w:hyperlink>
-    </w:p>
-    <w:p>
-      <w:pPr>
-        <w:pStyle w:val="Heading2"/>
-      </w:pPr>
-      <w:r>
-        <w:t>R07 — SBA-03, submission round 5</w:t>
-      </w:r>
-    </w:p>
-    <w:p>
-      <w:r>
-        <w:t>Builder: Antigravity. Reviewer: Codex. Recorded result: rejected for the specified implementation package. Other discovery/design verdicts in the same review are separate.</w:t>
-      </w:r>
-    </w:p>
-    <w:p>
-      <w:hyperlink r:id="rId26">
-        <w:r>
-          <w:rPr>
-            <w:color w:val="0563C1"/>
-          </w:rPr>
-          <w:t>CC_02_REVIEW_4.md</w:t>
-        </w:r>
-      </w:hyperlink>
-    </w:p>
-    <w:p>
-      <w:pPr>
-        <w:pStyle w:val="Heading2"/>
-      </w:pPr>
-      <w:r>
-        <w:t>R08 — CC-03, submission round 1</w:t>
-      </w:r>
-    </w:p>
-    <w:p>
-      <w:r>
-        <w:t>Builder: Antigravity. Reviewer: Codex. Recorded result: rejected for the specified implementation package. Other discovery/design verdicts in the same review are separate.</w:t>
-      </w:r>
-    </w:p>
-    <w:p>
-      <w:hyperlink r:id="rId27">
-        <w:r>
-          <w:rPr>
-            <w:color w:val="0563C1"/>
-          </w:rPr>
-          <w:t>CC_03_INDEPENDENT_REVIEW.md</w:t>
-        </w:r>
-      </w:hyperlink>
-    </w:p>
-    <w:p>
-      <w:pPr>
-        <w:pStyle w:val="Heading2"/>
-      </w:pPr>
-      <w:r>
-        <w:t>R09 — CC-03, submission round 2</w:t>
-      </w:r>
-    </w:p>
-    <w:p>
-      <w:r>
-        <w:t>Builder: Antigravity. Reviewer: Codex. Recorded result: rejected for the specified implementation package. Other discovery/design verdicts in the same review are separate.</w:t>
-      </w:r>
-    </w:p>
-    <w:p>
-      <w:hyperlink r:id="rId28">
-        <w:r>
-          <w:rPr>
-            <w:color w:val="0563C1"/>
-          </w:rPr>
-          <w:t>CC_03_REWORK_REVIEW.md</w:t>
-        </w:r>
-      </w:hyperlink>
-    </w:p>
-    <w:p>
-      <w:pPr>
-        <w:pStyle w:val="Heading2"/>
-      </w:pPr>
-      <w:r>
-        <w:t>R10 — CC-03, submission round 3</w:t>
-      </w:r>
-    </w:p>
-    <w:p>
-      <w:r>
-        <w:t>Builder: Antigravity. Reviewer: Codex. Recorded result: rejected for the specified implementation package. Other discovery/design verdicts in the same review are separate.</w:t>
-      </w:r>
-    </w:p>
-    <w:p>
-      <w:hyperlink r:id="rId29">
-        <w:r>
-          <w:rPr>
-            <w:color w:val="0563C1"/>
-          </w:rPr>
-          <w:t>CC_03_REVIEW_3.md</w:t>
-        </w:r>
-      </w:hyperlink>
-    </w:p>
-    <w:p>
-      <w:pPr>
-        <w:pStyle w:val="Heading2"/>
-      </w:pPr>
-      <w:r>
-        <w:t>R11 — CC-04, submission round 1</w:t>
-      </w:r>
-    </w:p>
-    <w:p>
-      <w:r>
-        <w:t>Builder: Antigravity. Reviewer: Codex. Recorded result: rejected for the specified implementation package. Other discovery/design verdicts in the same review are separate.</w:t>
-      </w:r>
-    </w:p>
-    <w:p>
-      <w:hyperlink r:id="rId30">
-        <w:r>
-          <w:rPr>
-            <w:color w:val="0563C1"/>
-          </w:rPr>
-          <w:t>CC_04_INDEPENDENT_REVIEW.md</w:t>
-        </w:r>
-      </w:hyperlink>
-    </w:p>
-    <w:p>
-      <w:pPr>
-        <w:pStyle w:val="Heading2"/>
-      </w:pPr>
-      <w:r>
-        <w:t>R12 — CC-04, submission round 2</w:t>
-      </w:r>
-    </w:p>
-    <w:p>
-      <w:r>
-        <w:t>Builder: Antigravity. Reviewer: Codex. Recorded result: rejected for the specified implementation package. Other discovery/design verdicts in the same review are separate.</w:t>
-      </w:r>
-    </w:p>
-    <w:p>
-      <w:hyperlink r:id="rId31">
-        <w:r>
-          <w:rPr>
-            <w:color w:val="0563C1"/>
-          </w:rPr>
-          <w:t>CC_04_REWORK_REVIEW.md</w:t>
-        </w:r>
-      </w:hyperlink>
-    </w:p>
-    <w:p>
-      <w:pPr>
-        <w:pStyle w:val="Heading2"/>
-      </w:pPr>
-      <w:r>
-        <w:t>R13 — CC-04, submission round 3</w:t>
-      </w:r>
-    </w:p>
-    <w:p>
-      <w:r>
-        <w:t>Builder: Antigravity. Reviewer: Codex. Recorded result: rejected for the specified implementation package. Other discovery/design verdicts in the same review are separate.</w:t>
-      </w:r>
-    </w:p>
-    <w:p>
-      <w:hyperlink r:id="rId32">
-        <w:r>
-          <w:rPr>
-            <w:color w:val="0563C1"/>
-          </w:rPr>
-          <w:t>CC_04_REVIEW_3.md</w:t>
-        </w:r>
-      </w:hyperlink>
-    </w:p>
-    <w:p>
-      <w:pPr>
-        <w:pStyle w:val="Heading2"/>
-      </w:pPr>
-      <w:r>
-        <w:t>R14 — CC-04, submission round 4</w:t>
-      </w:r>
-    </w:p>
-    <w:p>
-      <w:r>
-        <w:t>Builder: Antigravity. Reviewer: Codex. Recorded result: rejected for the specified implementation package. Other discovery/design verdicts in the same review are separate.</w:t>
-      </w:r>
-    </w:p>
-    <w:p>
-      <w:hyperlink r:id="rId33">
-        <w:r>
-          <w:rPr>
-            <w:color w:val="0563C1"/>
-          </w:rPr>
-          <w:t>CC_04_REVIEW_4.md</w:t>
-        </w:r>
-      </w:hyperlink>
-    </w:p>
-    <w:p>
-      <w:pPr>
-        <w:pStyle w:val="Heading2"/>
-      </w:pPr>
-      <w:r>
-        <w:t>R15 — CC-04, submission round 5</w:t>
-      </w:r>
-    </w:p>
-    <w:p>
-      <w:r>
-        <w:t>Builder: Antigravity. Reviewer: Codex. Recorded result: rejected for the specified implementation package. Other discovery/design verdicts in the same review are separate.</w:t>
-      </w:r>
-    </w:p>
-    <w:p>
-      <w:hyperlink r:id="rId34">
-        <w:r>
-          <w:rPr>
-            <w:color w:val="0563C1"/>
-          </w:rPr>
-          <w:t>CC_04_REVIEW_5.md</w:t>
-        </w:r>
-      </w:hyperlink>
-    </w:p>
-    <w:p>
-      <w:pPr>
-        <w:pStyle w:val="Heading2"/>
-      </w:pPr>
-      <w:r>
-        <w:t>R16 — CC-05/CC-06, submission round 1</w:t>
-      </w:r>
-    </w:p>
-    <w:p>
-      <w:r>
-        <w:t>Builder: Antigravity. Reviewer: Codex. Recorded result: rejected for the specified implementation package. Other discovery/design verdicts in the same review are separate.</w:t>
-      </w:r>
-    </w:p>
-    <w:p>
-      <w:hyperlink r:id="rId35">
-        <w:r>
-          <w:rPr>
-            <w:color w:val="0563C1"/>
-          </w:rPr>
-          <w:t>CC_05_06_INDEPENDENT_REVIEW.md</w:t>
-        </w:r>
-      </w:hyperlink>
-    </w:p>
-    <w:p>
-      <w:pPr>
-        <w:pStyle w:val="Heading2"/>
-      </w:pPr>
-      <w:r>
-        <w:t>R17 — CC-05/CC-06, submission round 2</w:t>
-      </w:r>
-    </w:p>
-    <w:p>
-      <w:r>
-        <w:t>Builder: Antigravity. Reviewer: Codex. Recorded result: rejected for the specified implementation package. Other discovery/design verdicts in the same review are separate.</w:t>
-      </w:r>
-    </w:p>
-    <w:p>
-      <w:hyperlink r:id="rId36">
-        <w:r>
-          <w:rPr>
-            <w:color w:val="0563C1"/>
-          </w:rPr>
-          <w:t>CC_05_06_REWORK_REVIEW.md</w:t>
-        </w:r>
-      </w:hyperlink>
-    </w:p>
-    <w:p>
-      <w:pPr>
-        <w:pStyle w:val="Heading1"/>
-      </w:pPr>
-      <w:r>
-        <w:t>12. What this evidence establishes</w:t>
-      </w:r>
-    </w:p>
-    <w:p>
-      <w:r>
-        <w:t>The documented reproduction sequences support repeated incomplete boundary fixes, insufficient adverse-case checks, mechanism–guarantee mismatches and gaps in historical integration coverage. They also establish evidence-reporting errors and evolving contract detail. They do not establish a universal provider ranking, engineering-hours rework percentage, or that every finding was an unchanged original requirement. Review observations and interpretations remain distinct.</w:t>
-      </w:r>
-    </w:p>
-    <w:p>
-      <w:r>
-        <w:br w:type="page"/>
-      </w:r>
-    </w:p>
-    <w:p>
-      <w:pPr>
-        <w:pStyle w:val="Heading1"/>
-      </w:pPr>
-      <w:r>
-        <w:t>13. Possible solutions and evaluation plan</w:t>
-      </w:r>
-    </w:p>
-    <w:p>
-      <w:r>
-        <w:t>These six interventions are proposals derived from the observed failure patterns. Their effectiveness has not yet been demonstrated. The purpose is to prevent avoidable rejection through earlier defect discovery and more complete corrections, while retaining independent acceptance. Routine technical preparation and handoffs belong to the coordinator, implementer and reviewer; the project owner supplies business direction and resolves scope or release decisions.</w:t>
-      </w:r>
-    </w:p>
-    <w:p>
-      <w:pPr>
-        <w:pStyle w:val="Heading2"/>
-      </w:pPr>
-      <w:r>
-        <w:t>13.1 Agree a versioned acceptance contract before coding</w:t>
-      </w:r>
-    </w:p>
-    <w:p>
-      <w:r>
-        <w:rPr>
-          <w:b/>
-        </w:rPr>
-        <w:t xml:space="preserve">Explanation: </w:t>
-      </w:r>
-      <w:r>
-        <w:t>The coordinator and reviewer translate the goal into required behavior, prohibited behavior, authorized scope, critical invariants and candidate-specific evidence. The implementer confirms understanding before starting. Cancellation, for example, distinguishes a stop request from confirmed termination and unresolved external effects.</w:t>
-      </w:r>
-    </w:p>
-    <w:p>
-      <w:r>
-        <w:rPr>
-          <w:b/>
-        </w:rPr>
-        <w:t xml:space="preserve">Application: </w:t>
-      </w:r>
-      <w:r>
-        <w:t>Create a task brief with requirement IDs, contract version, failure scenarios and acceptance checks. Preserve that baseline; any subsequent requirement addition is explicitly classified as scope change rather than automatically counted as an original implementation defect.</w:t>
-      </w:r>
-    </w:p>
-    <w:p>
-      <w:r>
-        <w:rPr>
-          <w:b/>
-        </w:rPr>
-        <w:t xml:space="preserve">Connection to findings: </w:t>
-      </w:r>
-      <w:r>
-        <w:t>Addresses ambiguous scope and requirements becoming more precise during review. It also makes first-pass acceptance a fairer comparison.</w:t>
-      </w:r>
-    </w:p>
-    <w:p>
-      <w:r>
-        <w:rPr>
-          <w:b/>
-        </w:rPr>
-        <w:t xml:space="preserve">Evaluation: </w:t>
-      </w:r>
-      <w:r>
-        <w:t>Measure rejection findings attributable to previously unspecified requirements and the fraction of tasks with an agreed baseline. Do not treat every clarification as scope change; compare it with the original requirement.</w:t>
-      </w:r>
-    </w:p>
-    <w:p>
-      <w:pPr>
-        <w:pStyle w:val="Heading2"/>
-      </w:pPr>
-      <w:r>
-        <w:t>13.2 Review the enforcement mechanism before implementation</w:t>
-      </w:r>
-    </w:p>
-    <w:p>
-      <w:r>
-        <w:rPr>
-          <w:b/>
-        </w:rPr>
-        <w:t xml:space="preserve">Explanation: </w:t>
-      </w:r>
-      <w:r>
-        <w:t>The implementer explains how each consequential rule is enforced. The reviewer assesses whether that mechanism provides the promised guarantee before substantial coding. A cooperative stop signal is insufficient for arbitrary uncooperative execution; a signature establishes integrity of bytes, not truth of the signed claim.</w:t>
-      </w:r>
-    </w:p>
-    <w:p>
-      <w:r>
-        <w:rPr>
-          <w:b/>
-        </w:rPr>
-        <w:t xml:space="preserve">Application: </w:t>
-      </w:r>
-      <w:r>
-        <w:t>Use a short design checkpoint for authority, isolation, funding, evidence and recovery decisions. State the threat/failure model, enforcement boundary and how the guarantee will be falsified in a test. Record reviewer concerns and disposition.</w:t>
-      </w:r>
-    </w:p>
-    <w:p>
-      <w:r>
-        <w:rPr>
-          <w:b/>
-        </w:rPr>
-        <w:t xml:space="preserve">Connection to findings: </w:t>
-      </w:r>
-      <w:r>
-        <w:t>Addresses mechanism–guarantee mismatches that otherwise require architecture repair after implementation.</w:t>
-      </w:r>
-    </w:p>
-    <w:p>
-      <w:r>
-        <w:rPr>
-          <w:b/>
-        </w:rPr>
-        <w:t xml:space="preserve">Evaluation: </w:t>
-      </w:r>
-      <w:r>
-        <w:t>Measure architecture-level rejection findings after the checkpoint and repeated changes to the enforcement design. Keep the checkpoint proportional to risk; avoid adding a large approval ceremony to routine changes.</w:t>
-      </w:r>
-    </w:p>
-    <w:p>
-      <w:pPr>
-        <w:pStyle w:val="Heading2"/>
-      </w:pPr>
-      <w:r>
-        <w:t>13.3 Deliver smaller, independently checkable increments</w:t>
-      </w:r>
-    </w:p>
-    <w:p>
-      <w:r>
-        <w:rPr>
-          <w:b/>
-        </w:rPr>
-        <w:t xml:space="preserve">Explanation: </w:t>
-      </w:r>
-      <w:r>
-        <w:t>Split complex work at coherent behavioral boundaries. Prove one boundary before relying on it in the next integration. For example, qualify funded dispatch admission, then execution supervision, then settlement. Each increment must demonstrate actual behavior, not merely contain scaffolding.</w:t>
-      </w:r>
-    </w:p>
-    <w:p>
-      <w:r>
-        <w:rPr>
-          <w:b/>
-        </w:rPr>
-        <w:t xml:space="preserve">Application: </w:t>
-      </w:r>
-      <w:r>
-        <w:t>Name the owner, interface, dependencies and evidence for each increment. Preserve a final end-to-end acceptance gate so individually passing pieces cannot be mistaken for a completed workflow.</w:t>
-      </w:r>
-    </w:p>
-    <w:p>
-      <w:r>
-        <w:rPr>
-          <w:b/>
-        </w:rPr>
-        <w:t xml:space="preserve">Connection to findings: </w:t>
-      </w:r>
-      <w:r>
-        <w:t>Addresses broad submissions with interacting defects and delayed discovery. Smaller increments are a delivery technique, not a reason to defer the complete loop indefinitely.</w:t>
-      </w:r>
-    </w:p>
-    <w:p>
-      <w:r>
-        <w:rPr>
-          <w:b/>
-        </w:rPr>
-        <w:t xml:space="preserve">Evaluation: </w:t>
-      </w:r>
-      <w:r>
-        <w:t>Measure rejection rounds per increment, cross-component regressions and completion of end-to-end milestones. Monitor fragmentation: more tiny tickets alone is not improvement.</w:t>
-      </w:r>
-    </w:p>
-    <w:p>
-      <w:pPr>
-        <w:pStyle w:val="Heading2"/>
-      </w:pPr>
-      <w:r>
-        <w:t>13.4 Require complete closure of every finding</w:t>
-      </w:r>
-    </w:p>
-    <w:p>
-      <w:r>
-        <w:rPr>
-          <w:b/>
-        </w:rPr>
-        <w:t xml:space="preserve">Explanation: </w:t>
-      </w:r>
-      <w:r>
-        <w:t>A rejection describes the underlying rule and reproduced failure. The implementer checks all affected operations, states and configurations, then provides a closure matrix mapping each finding to inspected paths, code changes and negative checks. Fixing only the reported example does not establish closure.</w:t>
-      </w:r>
-    </w:p>
-    <w:p>
-      <w:r>
-        <w:rPr>
-          <w:b/>
-        </w:rPr>
-        <w:t xml:space="preserve">Application: </w:t>
-      </w:r>
-      <w:r>
-        <w:t>For an authority bypass, enumerate all exposed mutations and trusted-only paths. For termination, cover timeout, cancellation, natural exit, crash and supported configuration. The reviewer repeats the original reproduction and checks related paths.</w:t>
-      </w:r>
-    </w:p>
-    <w:p>
-      <w:r>
-        <w:rPr>
-          <w:b/>
-        </w:rPr>
-        <w:t xml:space="preserve">Connection to findings: </w:t>
-      </w:r>
-      <w:r>
-        <w:t>Addresses recurring symptom-level fixes such as registry identity enforcement followed by unsafe configuration bypass.</w:t>
-      </w:r>
-    </w:p>
-    <w:p>
-      <w:r>
-        <w:rPr>
-          <w:b/>
-        </w:rPr>
-        <w:t xml:space="preserve">Evaluation: </w:t>
-      </w:r>
-      <w:r>
-        <w:t>Measure recurrence of the same requirement after claimed closure and missing entries in the closure matrix. Related manifestations should be grouped consistently rather than counted as unrelated successes.</w:t>
-      </w:r>
-    </w:p>
-    <w:p>
-      <w:pPr>
-        <w:pStyle w:val="Heading2"/>
-      </w:pPr>
-      <w:r>
-        <w:t>13.5 Use independent failure checks and disciplined evidence</w:t>
-      </w:r>
-    </w:p>
-    <w:p>
-      <w:r>
-        <w:rPr>
-          <w:b/>
-        </w:rPr>
-        <w:t xml:space="preserve">Explanation: </w:t>
-      </w:r>
-      <w:r>
-        <w:t>The implementer validates before submission; a separate reviewer challenges the guarantee with adverse cases. Checks must observe the relevant behavior: browser records must be asserted, and late side effects must be observed beyond their deadline. Evidence must identify the actual candidate, runner, environment and results.</w:t>
-      </w:r>
-    </w:p>
-    <w:p>
-      <w:r>
-        <w:rPr>
-          <w:b/>
-        </w:rPr>
-        <w:t xml:space="preserve">Application: </w:t>
-      </w:r>
-      <w:r>
-        <w:t>Use reviewer-owned probes for stale/revoked authority, forged evidence, conflicting outcomes, failure injection, budget boundaries and interrupted execution. Separate actual passes, failures, skips and unrun checks. Infrastructure limitations and review mistakes are recorded independently from code defects.</w:t>
-      </w:r>
-    </w:p>
-    <w:p>
-      <w:r>
-        <w:rPr>
-          <w:b/>
-        </w:rPr>
-        <w:t xml:space="preserve">Connection to findings: </w:t>
-      </w:r>
-      <w:r>
-        <w:t>Addresses passing suites that test weaker properties than the claimed guarantee and completion reports exceeding their evidence.</w:t>
-      </w:r>
-    </w:p>
-    <w:p>
-      <w:r>
-        <w:rPr>
-          <w:b/>
-        </w:rPr>
-        <w:t xml:space="preserve">Evaluation: </w:t>
-      </w:r>
-      <w:r>
-        <w:t>Measure unsupported completion claims, defects discovered after acceptance and outcomes of independent adverse-case checks. Test count alone is not an effectiveness metric.</w:t>
-      </w:r>
-    </w:p>
-    <w:p>
-      <w:pPr>
-        <w:pStyle w:val="Heading2"/>
-      </w:pPr>
-      <w:r>
-        <w:t>13.6 Pause repeated patching when the same rule fails again</w:t>
-      </w:r>
-    </w:p>
-    <w:p>
-      <w:r>
-        <w:rPr>
-          <w:b/>
-        </w:rPr>
-        <w:t xml:space="preserve">Explanation: </w:t>
-      </w:r>
-      <w:r>
-        <w:t>If a correction still violates the same invariant, stop the local patch cycle and diagnose why. Determine whether the requirement was misunderstood, the mechanism is inadequate, related paths were missed or a regression occurred. The coordinator manages this investigation rather than relying on the owner to relay another instruction.</w:t>
-      </w:r>
-    </w:p>
-    <w:p>
-      <w:r>
-        <w:rPr>
-          <w:b/>
-        </w:rPr>
-        <w:t xml:space="preserve">Application: </w:t>
-      </w:r>
-      <w:r>
-        <w:t>After a repeated failure of a claimed-closed rule, require a short reassessment and concrete corrective plan before another implementation attempt. Decide whether to clarify the contract, redesign the boundary, strengthen tests or change assignment. Preserve independent acceptance after the change.</w:t>
-      </w:r>
-    </w:p>
-    <w:p>
-      <w:r>
-        <w:rPr>
-          <w:b/>
-        </w:rPr>
-        <w:t xml:space="preserve">Connection to findings: </w:t>
-      </w:r>
-      <w:r>
-        <w:t>Addresses repeated corrections that do not improve the underlying design or verification strategy.</w:t>
-      </w:r>
-    </w:p>
-    <w:p>
-      <w:r>
-        <w:rPr>
-          <w:b/>
-        </w:rPr>
-        <w:t xml:space="preserve">Evaluation: </w:t>
-      </w:r>
-      <w:r>
-        <w:t>Measure additional rounds after recurrence, repeat issue families and routine owner handoffs. Escalate business choices to the owner; resolve ordinary technical corrections within the delivery team.</w:t>
-      </w:r>
-    </w:p>
-    <w:p>
-      <w:pPr>
-        <w:pStyle w:val="Heading1"/>
-      </w:pPr>
-      <w:r>
-        <w:t>14. Pilot and success measures for the proposed solutions</w:t>
-      </w:r>
-    </w:p>
-    <w:p>
-      <w:r>
-        <w:t>Apply the interventions to a bounded set of new tasks, recording task type, difficulty, requirement version, implementation owner and reviewer. Compare with the historical submission baseline where task scope is reasonably comparable. A small, nonrandom pilot can show useful process changes but cannot establish universal provider superiority.</w:t>
+        <w:t>Appendix C. Working sources</w:t>
       </w:r>
     </w:p>
     <w:p>
       <w:pPr>
         <w:pStyle w:val="ListBullet"/>
       </w:pPr>
-      <w:r>
-        <w:t>First-pass scoped acceptance: accepted first submissions divided by independently adjudicated first submissions. Report conditional and full acceptance separately.</w:t>
-      </w:r>
+      <w:r/>
+      <w:hyperlink r:id="rId36">
+        <w:r>
+          <w:t>AGENT_DELIVERY_RELIABILITY_AUDIT.md</w:t>
+        </w:r>
+      </w:hyperlink>
+      <w:r/>
     </w:p>
     <w:p>
       <w:pPr>
         <w:pStyle w:val="ListBullet"/>
       </w:pPr>
-      <w:r>
-        <w:t>Follow-up submission proportion: follow-up rounds divided by all reviewed rounds. This measures repetition, not hours wasted.</w:t>
-      </w:r>
+      <w:r/>
+      <w:hyperlink r:id="rId37">
+        <w:r>
+          <w:t>AGENT_DELIVERY_AUDIT_LEDGER.json</w:t>
+        </w:r>
+      </w:hyperlink>
+      <w:r/>
     </w:p>
     <w:p>
       <w:pPr>
         <w:pStyle w:val="ListBullet"/>
       </w:pPr>
-      <w:r>
-        <w:t>Finding recurrence: rules reported again after a correction claimed closure. Distinguish related manifestations from genuinely new requirements.</w:t>
-      </w:r>
+      <w:r/>
+      <w:hyperlink r:id="rId38">
+        <w:r>
+          <w:t>REWORK_CAUSE_ANALYSIS.md</w:t>
+        </w:r>
+      </w:hyperlink>
+      <w:r/>
     </w:p>
     <w:p>
       <w:pPr>
         <w:pStyle w:val="ListBullet"/>
       </w:pPr>
-      <w:r>
-        <w:t>Owner intervention: routine coordination and message-relay actions required per task, excluding business decisions and required release approval.</w:t>
-      </w:r>
+      <w:r/>
+      <w:hyperlink r:id="rId39">
+        <w:r>
+          <w:t>REWORK_CAUSE_LEDGER.json</w:t>
+        </w:r>
+      </w:hyperlink>
+      <w:r/>
     </w:p>
     <w:p>
       <w:pPr>
         <w:pStyle w:val="ListBullet"/>
       </w:pPr>
-      <w:r>
-        <w:t>Evidence quality: unsupported completion claims and accepted changes later found to violate the applicable requirements. Preserve observation windows and uncertainty.</w:t>
-      </w:r>
-    </w:p>
-    <w:p>
-      <w:r>
-        <w:t>No numeric reduction target is claimed as achieved. Success requires lower avoidable recurrence and owner intervention without weakened acceptance, concealed failures or postponed end-to-end qualification. Hours remain outside this initial study where unavailable.</w:t>
-      </w:r>
-    </w:p>
-    <w:p>
-      <w:r>
-        <w:br w:type="page"/>
-      </w:r>
-    </w:p>
-    <w:p>
-      <w:pPr>
-        <w:pStyle w:val="Heading1"/>
-      </w:pPr>
-      <w:r>
-        <w:t>15. Additional adjustments to the proposed delivery process</w:t>
-      </w:r>
-    </w:p>
-    <w:p>
-      <w:r>
-        <w:t>These four adjustments refine the six interventions. Acceptance becomes a shared engineering target before implementation, while the final acceptance decision remains independent. They are adopted as working guidance for subsequent scoped submissions; they do not retroactively change reviewed requirements, reopen accepted work, grant runtime permissions or implement coordinator automation.</w:t>
-      </w:r>
-    </w:p>
-    <w:p>
-      <w:pPr>
-        <w:pStyle w:val="Heading2"/>
-      </w:pPr>
-      <w:r>
-        <w:t>15.1 Share acceptance checks before implementation</w:t>
-      </w:r>
-    </w:p>
-    <w:p>
-      <w:r>
-        <w:t>The reviewer supplies known acceptance and failure checks alongside the versioned requirements before coding. The implementer can run them during development. Independent review may add probes, but newly discovered requirements must be distinguished from new tests exposing an existing requirement violation.</w:t>
-      </w:r>
-    </w:p>
-    <w:p>
-      <w:r>
-        <w:t>Application: Record requirement IDs, expected outcomes, candidate/environment prerequisites and the source of each check in the task brief.</w:t>
-      </w:r>
-    </w:p>
-    <w:p>
-      <w:pPr>
-        <w:pStyle w:val="Heading2"/>
-      </w:pPr>
-      <w:r>
-        <w:t>15.2 Require readiness evidence before formal submission</w:t>
-      </w:r>
-    </w:p>
-    <w:p>
-      <w:r>
-        <w:t>The implementer supplies a short self-check against every requirement with actual command/results, candidate identity, inspected related paths and explicit gaps. The coordinator checks completeness before requesting full independent review. This checks evidence completeness, not correctness or self-approval.</w:t>
-      </w:r>
-    </w:p>
-    <w:p>
-      <w:r>
-        <w:t>Application: If incomplete, record READINESS_RETURNED with the reason. Count this separately from formal rejection and retain it in total repeat-work reporting; do not hide retries by moving them to an earlier stage.</w:t>
-      </w:r>
-    </w:p>
-    <w:p>
-      <w:pPr>
-        <w:pStyle w:val="Heading2"/>
-      </w:pPr>
-      <w:r>
-        <w:t>15.3 Make reviewer decisions challengeable</w:t>
-      </w:r>
-    </w:p>
-    <w:p>
-      <w:r>
-        <w:t>Every blocking decision cites the applicable requirement/version, a reproduction or essential missing evidence, and the operational impact. The implementer may dispute requirement applicability, facts or severity. Resolve the disagreement before another patch; unresolved business/scope choices go to the owner.</w:t>
-      </w:r>
-    </w:p>
-    <w:p>
-      <w:r>
-        <w:t>Application: Record the finding, challenge, evidence and resolution. Distinguish confirmed violation, new scope, infrastructure gap and reviewer error. A challenge does not waive a real blocker or require owner relay for ordinary technical resolution.</w:t>
-      </w:r>
-    </w:p>
-    <w:p>
-      <w:pPr>
-        <w:pStyle w:val="Heading2"/>
-      </w:pPr>
-      <w:r>
-        <w:t>15.4 Pause when a corrected requirement fails again</w:t>
-      </w:r>
-    </w:p>
-    <w:p>
-      <w:r>
-        <w:t>When a submission claiming closure still violates the same invariant, stop requesting local patches. Coordinator, implementer and reviewer reassess the mechanism, related paths, brief and checks, then agree a concrete correction plan.</w:t>
-      </w:r>
-    </w:p>
-    <w:p>
-      <w:r>
-        <w:t>Application: Record RECURRENCE_PAUSED with linked finding and corrective design. Resume only after the technical plan is settled; use proportional review depth and retain final independent acceptance.</w:t>
-      </w:r>
-    </w:p>
-    <w:p>
-      <w:pPr>
-        <w:pStyle w:val="Heading1"/>
-      </w:pPr>
-      <w:r>
-        <w:t>16. Working sequence and safeguards</w:t>
-      </w:r>
-    </w:p>
-    <w:p>
-      <w:r>
-        <w:t>Versioned brief and shared checks → proportional design checkpoint → implementation and self-check → readiness screening → independent review → complete correction or scoped acceptance. A disputed blocker is resolved before patching; recurring invariant failure triggers design reassessment.</w:t>
-      </w:r>
-    </w:p>
-    <w:p>
-      <w:r>
-        <w:t>Routine frontend changes use a short checklist. Authority, funding, isolation, evidence and recovery changes receive explicit failure-matrix and enforcement-design review. Known checks remain visible; reviewers retain independent probes. Newly introduced scope is recorded, not disguised as an original defect.</w:t>
-      </w:r>
-    </w:p>
-    <w:p>
-      <w:r>
-        <w:t>Evaluate formal rejection, readiness returns, design revisions, repeat findings, rounds to scoped acceptance and owner handoffs together. A lower rejection count accompanied by more hidden readiness returns or weaker acceptance is not improvement. These additions change process guidance and documentation only; automatic enforcement remains implementation work.</w:t>
-      </w:r>
+      <w:r/>
+      <w:hyperlink r:id="rId40">
+        <w:r>
+          <w:t>DELIVERY_READINESS_AND_REVIEW_CHECKLIST.md</w:t>
+        </w:r>
+      </w:hyperlink>
+      <w:r/>
     </w:p>
     <w:sectPr>
       <w:pgSz w:w="12240" w:h="15840"/>

</xml_diff>